<commit_message>
ToDo App Project OOP Version Added
</commit_message>
<xml_diff>
--- a/MyDoc/PythonBasicsDoc.docx
+++ b/MyDoc/PythonBasicsDoc.docx
@@ -5,6 +5,7 @@
     <w:p>
       <w:pPr>
         <w:pStyle w:val="Heading2"/>
+        <w:bidi/>
       </w:pPr>
       <w:r>
         <w:t xml:space="preserve">## </w:t>
@@ -37,6 +38,7 @@
     <w:p>
       <w:pPr>
         <w:pStyle w:val="Heading3"/>
+        <w:bidi/>
       </w:pPr>
       <w:r>
         <w:rPr>
@@ -57,6 +59,7 @@
     <w:p>
       <w:pPr>
         <w:pStyle w:val="NormalWeb"/>
+        <w:bidi/>
       </w:pPr>
       <w:r>
         <w:rPr>
@@ -71,6 +74,7 @@
     <w:p>
       <w:pPr>
         <w:pStyle w:val="NormalWeb"/>
+        <w:bidi/>
       </w:pPr>
       <w:r>
         <w:rPr>
@@ -106,15 +110,19 @@
       </w:r>
     </w:p>
     <w:p>
+      <w:pPr>
+        <w:bidi/>
+      </w:pPr>
       <w:r>
         <w:pict w14:anchorId="0C1E4BC9">
-          <v:rect id="_x0000_i1029" style="width:0;height:1.5pt" o:hralign="center" o:hrstd="t" o:hr="t" fillcolor="#a0a0a0" stroked="f"/>
+          <v:rect id="_x0000_i1025" style="width:0;height:1.5pt" o:hralign="right" o:hrstd="t" o:hr="t" fillcolor="#a0a0a0" stroked="f"/>
         </w:pict>
       </w:r>
     </w:p>
     <w:p>
       <w:pPr>
         <w:pStyle w:val="Heading3"/>
+        <w:bidi/>
       </w:pPr>
       <w:r>
         <w:rPr>
@@ -129,6 +137,7 @@
     <w:p>
       <w:pPr>
         <w:pStyle w:val="Heading4"/>
+        <w:bidi/>
       </w:pPr>
       <w:r>
         <w:t xml:space="preserve">1.1 </w:t>
@@ -170,6 +179,7 @@
           <w:ilvl w:val="0"/>
           <w:numId w:val="8"/>
         </w:numPr>
+        <w:bidi/>
       </w:pPr>
       <w:r>
         <w:rPr>
@@ -241,6 +251,7 @@
           <w:ilvl w:val="0"/>
           <w:numId w:val="8"/>
         </w:numPr>
+        <w:bidi/>
       </w:pPr>
       <w:r>
         <w:rPr>
@@ -285,6 +296,9 @@
       </w:r>
     </w:p>
     <w:p>
+      <w:pPr>
+        <w:bidi/>
+      </w:pPr>
       <w:r>
         <w:rPr>
           <w:rStyle w:val="ng-tns-c1037761049-162"/>
@@ -295,6 +309,7 @@
     <w:p>
       <w:pPr>
         <w:pStyle w:val="HTMLPreformatted"/>
+        <w:bidi/>
         <w:rPr>
           <w:rStyle w:val="HTMLCode"/>
         </w:rPr>
@@ -330,6 +345,7 @@
     <w:p>
       <w:pPr>
         <w:pStyle w:val="HTMLPreformatted"/>
+        <w:bidi/>
         <w:rPr>
           <w:rStyle w:val="HTMLCode"/>
         </w:rPr>
@@ -364,6 +380,7 @@
     <w:p>
       <w:pPr>
         <w:pStyle w:val="HTMLPreformatted"/>
+        <w:bidi/>
         <w:rPr>
           <w:rStyle w:val="HTMLCode"/>
         </w:rPr>
@@ -384,6 +401,7 @@
     <w:p>
       <w:pPr>
         <w:pStyle w:val="HTMLPreformatted"/>
+        <w:bidi/>
         <w:rPr>
           <w:rStyle w:val="HTMLCode"/>
         </w:rPr>
@@ -392,6 +410,7 @@
     <w:p>
       <w:pPr>
         <w:pStyle w:val="HTMLPreformatted"/>
+        <w:bidi/>
         <w:rPr>
           <w:rStyle w:val="HTMLCode"/>
         </w:rPr>
@@ -426,6 +445,7 @@
     <w:p>
       <w:pPr>
         <w:pStyle w:val="HTMLPreformatted"/>
+        <w:bidi/>
         <w:rPr>
           <w:rStyle w:val="HTMLCode"/>
         </w:rPr>
@@ -454,6 +474,7 @@
     <w:p>
       <w:pPr>
         <w:pStyle w:val="HTMLPreformatted"/>
+        <w:bidi/>
         <w:rPr>
           <w:rStyle w:val="HTMLCode"/>
         </w:rPr>
@@ -482,6 +503,7 @@
     <w:p>
       <w:pPr>
         <w:pStyle w:val="Heading4"/>
+        <w:bidi/>
       </w:pPr>
       <w:r>
         <w:t xml:space="preserve">1.2 </w:t>
@@ -539,6 +561,7 @@
           <w:ilvl w:val="0"/>
           <w:numId w:val="9"/>
         </w:numPr>
+        <w:bidi/>
       </w:pPr>
       <w:r>
         <w:rPr>
@@ -593,6 +616,7 @@
           <w:ilvl w:val="0"/>
           <w:numId w:val="9"/>
         </w:numPr>
+        <w:bidi/>
       </w:pPr>
       <w:r>
         <w:rPr>
@@ -637,6 +661,7 @@
     <w:p>
       <w:pPr>
         <w:pStyle w:val="Heading4"/>
+        <w:bidi/>
       </w:pPr>
       <w:r>
         <w:t xml:space="preserve">1.3 </w:t>
@@ -667,6 +692,7 @@
           <w:ilvl w:val="0"/>
           <w:numId w:val="10"/>
         </w:numPr>
+        <w:bidi/>
       </w:pPr>
       <w:r>
         <w:rPr>
@@ -719,6 +745,7 @@
           <w:ilvl w:val="0"/>
           <w:numId w:val="10"/>
         </w:numPr>
+        <w:bidi/>
       </w:pPr>
       <w:r>
         <w:rPr>
@@ -741,6 +768,9 @@
       </w:r>
     </w:p>
     <w:p>
+      <w:pPr>
+        <w:bidi/>
+      </w:pPr>
       <w:r>
         <w:rPr>
           <w:rStyle w:val="ng-tns-c1037761049-163"/>
@@ -751,6 +781,7 @@
     <w:p>
       <w:pPr>
         <w:pStyle w:val="HTMLPreformatted"/>
+        <w:bidi/>
         <w:rPr>
           <w:rStyle w:val="HTMLCode"/>
         </w:rPr>
@@ -785,6 +816,7 @@
     <w:p>
       <w:pPr>
         <w:pStyle w:val="HTMLPreformatted"/>
+        <w:bidi/>
         <w:rPr>
           <w:rStyle w:val="HTMLCode"/>
         </w:rPr>
@@ -886,6 +918,7 @@
     <w:p>
       <w:pPr>
         <w:pStyle w:val="HTMLPreformatted"/>
+        <w:bidi/>
         <w:rPr>
           <w:rStyle w:val="HTMLCode"/>
         </w:rPr>
@@ -906,6 +939,7 @@
     <w:p>
       <w:pPr>
         <w:pStyle w:val="HTMLPreformatted"/>
+        <w:bidi/>
         <w:rPr>
           <w:rStyle w:val="HTMLCode"/>
         </w:rPr>
@@ -944,6 +978,7 @@
     <w:p>
       <w:pPr>
         <w:pStyle w:val="HTMLPreformatted"/>
+        <w:bidi/>
         <w:rPr>
           <w:rStyle w:val="HTMLCode"/>
         </w:rPr>
@@ -982,6 +1017,7 @@
     <w:p>
       <w:pPr>
         <w:pStyle w:val="HTMLPreformatted"/>
+        <w:bidi/>
         <w:rPr>
           <w:rStyle w:val="HTMLCode"/>
         </w:rPr>
@@ -1012,6 +1048,7 @@
     <w:p>
       <w:pPr>
         <w:pStyle w:val="HTMLPreformatted"/>
+        <w:bidi/>
         <w:rPr>
           <w:rStyle w:val="HTMLCode"/>
         </w:rPr>
@@ -1020,6 +1057,7 @@
     <w:p>
       <w:pPr>
         <w:pStyle w:val="HTMLPreformatted"/>
+        <w:bidi/>
         <w:rPr>
           <w:rStyle w:val="HTMLCode"/>
         </w:rPr>
@@ -1040,6 +1078,7 @@
     <w:p>
       <w:pPr>
         <w:pStyle w:val="HTMLPreformatted"/>
+        <w:bidi/>
         <w:rPr>
           <w:rStyle w:val="HTMLCode"/>
         </w:rPr>
@@ -1092,6 +1131,7 @@
     <w:p>
       <w:pPr>
         <w:pStyle w:val="HTMLPreformatted"/>
+        <w:bidi/>
         <w:rPr>
           <w:rStyle w:val="HTMLCode"/>
         </w:rPr>
@@ -1178,6 +1218,7 @@
     <w:p>
       <w:pPr>
         <w:pStyle w:val="HTMLPreformatted"/>
+        <w:bidi/>
         <w:rPr>
           <w:rStyle w:val="HTMLCode"/>
         </w:rPr>
@@ -1186,6 +1227,7 @@
     <w:p>
       <w:pPr>
         <w:pStyle w:val="HTMLPreformatted"/>
+        <w:bidi/>
         <w:rPr>
           <w:rStyle w:val="HTMLCode"/>
         </w:rPr>
@@ -1258,6 +1300,7 @@
     <w:p>
       <w:pPr>
         <w:pStyle w:val="HTMLPreformatted"/>
+        <w:bidi/>
         <w:rPr>
           <w:rStyle w:val="HTMLCode"/>
         </w:rPr>
@@ -1293,6 +1336,7 @@
     <w:p>
       <w:pPr>
         <w:pStyle w:val="NormalWeb"/>
+        <w:bidi/>
       </w:pPr>
       <w:r>
         <w:rPr>
@@ -1384,15 +1428,19 @@
       </w:r>
     </w:p>
     <w:p>
+      <w:pPr>
+        <w:bidi/>
+      </w:pPr>
       <w:r>
         <w:pict w14:anchorId="014E0A75">
-          <v:rect id="_x0000_i1030" style="width:0;height:1.5pt" o:hralign="center" o:hrstd="t" o:hr="t" fillcolor="#a0a0a0" stroked="f"/>
+          <v:rect id="_x0000_i1026" style="width:0;height:1.5pt" o:hralign="right" o:hrstd="t" o:hr="t" fillcolor="#a0a0a0" stroked="f"/>
         </w:pict>
       </w:r>
     </w:p>
     <w:p>
       <w:pPr>
         <w:pStyle w:val="Heading3"/>
+        <w:bidi/>
       </w:pPr>
       <w:r>
         <w:rPr>
@@ -1404,6 +1452,7 @@
     <w:p>
       <w:pPr>
         <w:pStyle w:val="Heading4"/>
+        <w:bidi/>
       </w:pPr>
       <w:r>
         <w:t xml:space="preserve">2.1 </w:t>
@@ -1421,6 +1470,7 @@
     <w:p>
       <w:pPr>
         <w:pStyle w:val="NormalWeb"/>
+        <w:bidi/>
       </w:pPr>
       <w:r>
         <w:rPr>
@@ -1433,6 +1483,9 @@
       </w:r>
     </w:p>
     <w:p>
+      <w:pPr>
+        <w:bidi/>
+      </w:pPr>
       <w:r>
         <w:rPr>
           <w:rStyle w:val="ng-tns-c1037761049-164"/>
@@ -1443,6 +1496,7 @@
     <w:p>
       <w:pPr>
         <w:pStyle w:val="HTMLPreformatted"/>
+        <w:bidi/>
         <w:rPr>
           <w:rStyle w:val="HTMLCode"/>
         </w:rPr>
@@ -1477,6 +1531,7 @@
     <w:p>
       <w:pPr>
         <w:pStyle w:val="HTMLPreformatted"/>
+        <w:bidi/>
         <w:rPr>
           <w:rStyle w:val="HTMLCode"/>
         </w:rPr>
@@ -1530,6 +1585,7 @@
     <w:p>
       <w:pPr>
         <w:pStyle w:val="HTMLPreformatted"/>
+        <w:bidi/>
         <w:rPr>
           <w:rStyle w:val="HTMLCode"/>
         </w:rPr>
@@ -1538,6 +1594,7 @@
     <w:p>
       <w:pPr>
         <w:pStyle w:val="HTMLPreformatted"/>
+        <w:bidi/>
         <w:rPr>
           <w:rStyle w:val="HTMLCode"/>
         </w:rPr>
@@ -1590,6 +1647,7 @@
     <w:p>
       <w:pPr>
         <w:pStyle w:val="HTMLPreformatted"/>
+        <w:bidi/>
         <w:rPr>
           <w:rStyle w:val="HTMLCode"/>
         </w:rPr>
@@ -1679,6 +1737,7 @@
     <w:p>
       <w:pPr>
         <w:pStyle w:val="Heading4"/>
+        <w:bidi/>
       </w:pPr>
       <w:r>
         <w:t xml:space="preserve">2.2 </w:t>
@@ -1700,6 +1759,7 @@
           <w:ilvl w:val="0"/>
           <w:numId w:val="11"/>
         </w:numPr>
+        <w:bidi/>
       </w:pPr>
       <w:r>
         <w:rPr>
@@ -1736,6 +1796,7 @@
           <w:ilvl w:val="1"/>
           <w:numId w:val="11"/>
         </w:numPr>
+        <w:bidi/>
       </w:pPr>
       <w:r>
         <w:rPr>
@@ -1784,6 +1845,7 @@
           <w:ilvl w:val="1"/>
           <w:numId w:val="11"/>
         </w:numPr>
+        <w:bidi/>
       </w:pPr>
       <w:r>
         <w:rPr>
@@ -1852,6 +1914,7 @@
           <w:ilvl w:val="1"/>
           <w:numId w:val="11"/>
         </w:numPr>
+        <w:bidi/>
       </w:pPr>
       <w:r>
         <w:rPr>
@@ -1929,6 +1992,7 @@
           <w:ilvl w:val="0"/>
           <w:numId w:val="11"/>
         </w:numPr>
+        <w:bidi/>
       </w:pPr>
       <w:r>
         <w:rPr>
@@ -1980,6 +2044,7 @@
           <w:ilvl w:val="0"/>
           <w:numId w:val="11"/>
         </w:numPr>
+        <w:bidi/>
       </w:pPr>
       <w:r>
         <w:rPr>
@@ -2016,6 +2081,7 @@
           <w:ilvl w:val="0"/>
           <w:numId w:val="11"/>
         </w:numPr>
+        <w:bidi/>
       </w:pPr>
       <w:r>
         <w:rPr>
@@ -2048,6 +2114,7 @@
     <w:p>
       <w:pPr>
         <w:pStyle w:val="NormalWeb"/>
+        <w:bidi/>
       </w:pPr>
       <w:r>
         <w:rPr>
@@ -2158,15 +2225,19 @@
       </w:r>
     </w:p>
     <w:p>
+      <w:pPr>
+        <w:bidi/>
+      </w:pPr>
       <w:r>
         <w:pict w14:anchorId="29F3D2F8">
-          <v:rect id="_x0000_i1031" style="width:0;height:1.5pt" o:hralign="center" o:hrstd="t" o:hr="t" fillcolor="#a0a0a0" stroked="f"/>
+          <v:rect id="_x0000_i1027" style="width:0;height:1.5pt" o:hralign="right" o:hrstd="t" o:hr="t" fillcolor="#a0a0a0" stroked="f"/>
         </w:pict>
       </w:r>
     </w:p>
     <w:p>
       <w:pPr>
         <w:pStyle w:val="Heading3"/>
+        <w:bidi/>
       </w:pPr>
       <w:r>
         <w:rPr>
@@ -2178,6 +2249,7 @@
     <w:p>
       <w:pPr>
         <w:pStyle w:val="Heading4"/>
+        <w:bidi/>
       </w:pPr>
       <w:r>
         <w:t xml:space="preserve">3.1 </w:t>
@@ -2211,6 +2283,7 @@
     <w:p>
       <w:pPr>
         <w:pStyle w:val="NormalWeb"/>
+        <w:bidi/>
       </w:pPr>
       <w:r>
         <w:rPr>
@@ -2312,6 +2385,9 @@
       </w:r>
     </w:p>
     <w:p>
+      <w:pPr>
+        <w:bidi/>
+      </w:pPr>
       <w:r>
         <w:rPr>
           <w:rStyle w:val="ng-tns-c1037761049-165"/>
@@ -2322,6 +2398,7 @@
     <w:p>
       <w:pPr>
         <w:pStyle w:val="HTMLPreformatted"/>
+        <w:bidi/>
         <w:rPr>
           <w:rStyle w:val="HTMLCode"/>
         </w:rPr>
@@ -2371,6 +2448,7 @@
     <w:p>
       <w:pPr>
         <w:pStyle w:val="HTMLPreformatted"/>
+        <w:bidi/>
         <w:rPr>
           <w:rStyle w:val="HTMLCode"/>
         </w:rPr>
@@ -2479,6 +2557,7 @@
     <w:p>
       <w:pPr>
         <w:pStyle w:val="HTMLPreformatted"/>
+        <w:bidi/>
         <w:rPr>
           <w:rStyle w:val="HTMLCode"/>
         </w:rPr>
@@ -2568,6 +2647,7 @@
     <w:p>
       <w:pPr>
         <w:pStyle w:val="HTMLPreformatted"/>
+        <w:bidi/>
         <w:rPr>
           <w:rStyle w:val="HTMLCode"/>
         </w:rPr>
@@ -2612,6 +2692,7 @@
     <w:p>
       <w:pPr>
         <w:pStyle w:val="Heading4"/>
+        <w:bidi/>
       </w:pPr>
       <w:r>
         <w:t xml:space="preserve">3.2 </w:t>
@@ -2647,6 +2728,7 @@
           <w:ilvl w:val="0"/>
           <w:numId w:val="12"/>
         </w:numPr>
+        <w:bidi/>
       </w:pPr>
       <w:r>
         <w:rPr>
@@ -2741,6 +2823,7 @@
           <w:ilvl w:val="0"/>
           <w:numId w:val="12"/>
         </w:numPr>
+        <w:bidi/>
       </w:pPr>
       <w:r>
         <w:rPr>
@@ -2783,6 +2866,7 @@
     <w:p>
       <w:pPr>
         <w:pStyle w:val="NormalWeb"/>
+        <w:bidi/>
       </w:pPr>
       <w:r>
         <w:rPr>
@@ -2928,15 +3012,19 @@
       </w:r>
     </w:p>
     <w:p>
+      <w:pPr>
+        <w:bidi/>
+      </w:pPr>
       <w:r>
         <w:pict w14:anchorId="09F12ADF">
-          <v:rect id="_x0000_i1032" style="width:0;height:1.5pt" o:hralign="center" o:hrstd="t" o:hr="t" fillcolor="#a0a0a0" stroked="f"/>
+          <v:rect id="_x0000_i1028" style="width:0;height:1.5pt" o:hralign="right" o:hrstd="t" o:hr="t" fillcolor="#a0a0a0" stroked="f"/>
         </w:pict>
       </w:r>
     </w:p>
     <w:p>
       <w:pPr>
         <w:pStyle w:val="Heading3"/>
+        <w:bidi/>
       </w:pPr>
       <w:r>
         <w:rPr>
@@ -2948,6 +3036,7 @@
     <w:p>
       <w:pPr>
         <w:pStyle w:val="Heading4"/>
+        <w:bidi/>
       </w:pPr>
       <w:r>
         <w:t xml:space="preserve">4.1 </w:t>
@@ -2999,6 +3088,7 @@
           <w:ilvl w:val="0"/>
           <w:numId w:val="13"/>
         </w:numPr>
+        <w:bidi/>
       </w:pPr>
       <w:r>
         <w:rPr>
@@ -3053,6 +3143,7 @@
           <w:ilvl w:val="0"/>
           <w:numId w:val="13"/>
         </w:numPr>
+        <w:bidi/>
       </w:pPr>
       <w:r>
         <w:rPr>
@@ -3103,6 +3194,7 @@
     <w:p>
       <w:pPr>
         <w:pStyle w:val="Heading4"/>
+        <w:bidi/>
       </w:pPr>
       <w:r>
         <w:t>4.2 Operator Overloading (</w:t>
@@ -3147,6 +3239,7 @@
     <w:p>
       <w:pPr>
         <w:pStyle w:val="NormalWeb"/>
+        <w:bidi/>
       </w:pPr>
       <w:r>
         <w:rPr>
@@ -3197,6 +3290,9 @@
       </w:r>
     </w:p>
     <w:p>
+      <w:pPr>
+        <w:bidi/>
+      </w:pPr>
       <w:r>
         <w:rPr>
           <w:rStyle w:val="ng-tns-c1037761049-166"/>
@@ -3207,6 +3303,7 @@
     <w:p>
       <w:pPr>
         <w:pStyle w:val="HTMLPreformatted"/>
+        <w:bidi/>
         <w:rPr>
           <w:rStyle w:val="HTMLCode"/>
         </w:rPr>
@@ -3234,6 +3331,7 @@
     <w:p>
       <w:pPr>
         <w:pStyle w:val="HTMLPreformatted"/>
+        <w:bidi/>
         <w:rPr>
           <w:rStyle w:val="HTMLCode"/>
         </w:rPr>
@@ -3286,6 +3384,7 @@
     <w:p>
       <w:pPr>
         <w:pStyle w:val="HTMLPreformatted"/>
+        <w:bidi/>
         <w:rPr>
           <w:rStyle w:val="HTMLCode"/>
         </w:rPr>
@@ -3336,6 +3435,7 @@
     <w:p>
       <w:pPr>
         <w:pStyle w:val="Heading4"/>
+        <w:bidi/>
         <w:rPr>
           <w:b/>
           <w:bCs/>
@@ -3388,6 +3488,7 @@
     <w:p>
       <w:pPr>
         <w:pStyle w:val="NormalWeb"/>
+        <w:bidi/>
       </w:pPr>
       <w:r>
         <w:rPr>
@@ -3406,6 +3507,7 @@
           <w:ilvl w:val="0"/>
           <w:numId w:val="14"/>
         </w:numPr>
+        <w:bidi/>
       </w:pPr>
       <w:r>
         <w:rPr>
@@ -3471,6 +3573,7 @@
           <w:ilvl w:val="0"/>
           <w:numId w:val="14"/>
         </w:numPr>
+        <w:bidi/>
       </w:pPr>
       <w:r>
         <w:rPr>
@@ -3536,6 +3639,7 @@
           <w:ilvl w:val="0"/>
           <w:numId w:val="14"/>
         </w:numPr>
+        <w:bidi/>
       </w:pPr>
       <w:r>
         <w:rPr>
@@ -3612,6 +3716,7 @@
     <w:p>
       <w:pPr>
         <w:pStyle w:val="NormalWeb"/>
+        <w:bidi/>
         <w:rPr>
           <w:rtl/>
         </w:rPr>
@@ -3686,6 +3791,7 @@
     <w:p>
       <w:pPr>
         <w:pStyle w:val="Heading1"/>
+        <w:bidi/>
         <w:rPr>
           <w:rFonts w:eastAsia="Times New Roman"/>
           <w:b/>
@@ -3740,6 +3846,7 @@
     <w:p>
       <w:pPr>
         <w:pStyle w:val="Heading2"/>
+        <w:bidi/>
       </w:pPr>
       <w:r>
         <w:t xml:space="preserve">## </w:t>
@@ -3762,6 +3869,7 @@
     <w:p>
       <w:pPr>
         <w:pStyle w:val="Heading3"/>
+        <w:bidi/>
       </w:pPr>
       <w:r>
         <w:t xml:space="preserve">1. </w:t>
@@ -3788,6 +3896,7 @@
     <w:p>
       <w:pPr>
         <w:pStyle w:val="NormalWeb"/>
+        <w:bidi/>
       </w:pPr>
       <w:r>
         <w:rPr>
@@ -3865,6 +3974,7 @@
           <w:ilvl w:val="0"/>
           <w:numId w:val="4"/>
         </w:numPr>
+        <w:bidi/>
       </w:pPr>
       <w:r>
         <w:rPr>
@@ -3919,6 +4029,7 @@
           <w:ilvl w:val="0"/>
           <w:numId w:val="4"/>
         </w:numPr>
+        <w:bidi/>
       </w:pPr>
       <w:r>
         <w:rPr>
@@ -3938,6 +4049,7 @@
     </w:p>
     <w:p>
       <w:pPr>
+        <w:bidi/>
         <w:spacing w:beforeAutospacing="1" w:afterAutospacing="1"/>
         <w:ind w:left="720"/>
       </w:pPr>
@@ -3951,6 +4063,7 @@
     <w:p>
       <w:pPr>
         <w:pStyle w:val="HTMLPreformatted"/>
+        <w:bidi/>
         <w:ind w:left="720"/>
         <w:rPr>
           <w:rStyle w:val="HTMLCode"/>
@@ -3974,6 +4087,7 @@
     <w:p>
       <w:pPr>
         <w:pStyle w:val="HTMLPreformatted"/>
+        <w:bidi/>
         <w:ind w:left="720"/>
         <w:rPr>
           <w:rStyle w:val="HTMLCode"/>
@@ -4022,6 +4136,7 @@
     <w:p>
       <w:pPr>
         <w:pStyle w:val="HTMLPreformatted"/>
+        <w:bidi/>
         <w:ind w:left="720"/>
         <w:rPr>
           <w:rStyle w:val="HTMLCode"/>
@@ -4056,6 +4171,7 @@
     <w:p>
       <w:pPr>
         <w:pStyle w:val="HTMLPreformatted"/>
+        <w:bidi/>
         <w:ind w:left="720"/>
         <w:rPr>
           <w:rStyle w:val="HTMLCode"/>
@@ -4105,6 +4221,7 @@
     <w:p>
       <w:pPr>
         <w:pStyle w:val="HTMLPreformatted"/>
+        <w:bidi/>
         <w:ind w:left="720"/>
         <w:rPr>
           <w:rStyle w:val="HTMLCode"/>
@@ -4197,6 +4314,7 @@
           <w:ilvl w:val="0"/>
           <w:numId w:val="4"/>
         </w:numPr>
+        <w:bidi/>
       </w:pPr>
       <w:r>
         <w:rPr>
@@ -4238,6 +4356,7 @@
     <w:p>
       <w:pPr>
         <w:pStyle w:val="Heading3"/>
+        <w:bidi/>
       </w:pPr>
       <w:r>
         <w:t xml:space="preserve">2. </w:t>
@@ -4268,6 +4387,7 @@
           <w:ilvl w:val="0"/>
           <w:numId w:val="5"/>
         </w:numPr>
+        <w:bidi/>
       </w:pPr>
       <w:r>
         <w:rPr>
@@ -4328,6 +4448,7 @@
           <w:ilvl w:val="0"/>
           <w:numId w:val="5"/>
         </w:numPr>
+        <w:bidi/>
       </w:pPr>
       <w:r>
         <w:rPr>
@@ -4347,6 +4468,7 @@
     </w:p>
     <w:p>
       <w:pPr>
+        <w:bidi/>
         <w:spacing w:beforeAutospacing="1" w:afterAutospacing="1"/>
         <w:ind w:left="720"/>
       </w:pPr>
@@ -4360,6 +4482,7 @@
     <w:p>
       <w:pPr>
         <w:pStyle w:val="HTMLPreformatted"/>
+        <w:bidi/>
         <w:ind w:left="720"/>
         <w:rPr>
           <w:rStyle w:val="HTMLCode"/>
@@ -4383,6 +4506,7 @@
     <w:p>
       <w:pPr>
         <w:pStyle w:val="HTMLPreformatted"/>
+        <w:bidi/>
         <w:ind w:left="720"/>
         <w:rPr>
           <w:rStyle w:val="HTMLCode"/>
@@ -4433,6 +4557,7 @@
     <w:p>
       <w:pPr>
         <w:pStyle w:val="HTMLPreformatted"/>
+        <w:bidi/>
         <w:ind w:left="720"/>
         <w:rPr>
           <w:rStyle w:val="HTMLCode"/>
@@ -4467,6 +4592,7 @@
     <w:p>
       <w:pPr>
         <w:pStyle w:val="HTMLPreformatted"/>
+        <w:bidi/>
         <w:ind w:left="720"/>
         <w:rPr>
           <w:rStyle w:val="HTMLCode"/>
@@ -4516,6 +4642,7 @@
     <w:p>
       <w:pPr>
         <w:pStyle w:val="HTMLPreformatted"/>
+        <w:bidi/>
         <w:ind w:left="720"/>
         <w:rPr>
           <w:rStyle w:val="HTMLCode"/>
@@ -4587,6 +4714,7 @@
     <w:p>
       <w:pPr>
         <w:pStyle w:val="HTMLPreformatted"/>
+        <w:bidi/>
         <w:ind w:left="720"/>
         <w:rPr>
           <w:rStyle w:val="HTMLCode"/>
@@ -4627,6 +4755,7 @@
     <w:p>
       <w:pPr>
         <w:pStyle w:val="HTMLPreformatted"/>
+        <w:bidi/>
         <w:ind w:left="720"/>
         <w:rPr>
           <w:rStyle w:val="HTMLCode"/>
@@ -4670,6 +4799,7 @@
           <w:ilvl w:val="0"/>
           <w:numId w:val="5"/>
         </w:numPr>
+        <w:bidi/>
       </w:pPr>
       <w:r>
         <w:rPr>
@@ -4715,6 +4845,7 @@
           <w:ilvl w:val="0"/>
           <w:numId w:val="5"/>
         </w:numPr>
+        <w:bidi/>
       </w:pPr>
       <w:r>
         <w:rPr>
@@ -4778,21 +4909,25 @@
     <w:p>
       <w:pPr>
         <w:pStyle w:val="NormalWeb"/>
+        <w:bidi/>
       </w:pPr>
     </w:p>
     <w:p>
       <w:pPr>
         <w:pStyle w:val="NormalWeb"/>
+        <w:bidi/>
       </w:pPr>
     </w:p>
     <w:p>
       <w:pPr>
         <w:pStyle w:val="NormalWeb"/>
+        <w:bidi/>
       </w:pPr>
     </w:p>
     <w:p>
       <w:pPr>
         <w:pStyle w:val="Heading3"/>
+        <w:bidi/>
       </w:pPr>
       <w:r>
         <w:t xml:space="preserve">3. </w:t>
@@ -4823,6 +4958,7 @@
           <w:ilvl w:val="0"/>
           <w:numId w:val="6"/>
         </w:numPr>
+        <w:bidi/>
       </w:pPr>
       <w:r>
         <w:rPr>
@@ -4878,6 +5014,7 @@
           <w:ilvl w:val="0"/>
           <w:numId w:val="6"/>
         </w:numPr>
+        <w:bidi/>
       </w:pPr>
       <w:r>
         <w:rPr>
@@ -4897,6 +5034,7 @@
     </w:p>
     <w:p>
       <w:pPr>
+        <w:bidi/>
         <w:spacing w:beforeAutospacing="1" w:afterAutospacing="1"/>
         <w:ind w:left="720"/>
       </w:pPr>
@@ -4910,6 +5048,7 @@
     <w:p>
       <w:pPr>
         <w:pStyle w:val="HTMLPreformatted"/>
+        <w:bidi/>
         <w:ind w:left="720"/>
         <w:rPr>
           <w:rStyle w:val="HTMLCode"/>
@@ -4933,6 +5072,7 @@
     <w:p>
       <w:pPr>
         <w:pStyle w:val="HTMLPreformatted"/>
+        <w:bidi/>
         <w:ind w:left="720"/>
         <w:rPr>
           <w:rStyle w:val="HTMLCode"/>
@@ -4981,6 +5121,7 @@
     <w:p>
       <w:pPr>
         <w:pStyle w:val="HTMLPreformatted"/>
+        <w:bidi/>
         <w:ind w:left="720"/>
         <w:rPr>
           <w:rStyle w:val="HTMLCode"/>
@@ -5015,6 +5156,7 @@
     <w:p>
       <w:pPr>
         <w:pStyle w:val="HTMLPreformatted"/>
+        <w:bidi/>
         <w:ind w:left="720"/>
         <w:rPr>
           <w:rStyle w:val="HTMLCode"/>
@@ -5064,6 +5206,7 @@
     <w:p>
       <w:pPr>
         <w:pStyle w:val="HTMLPreformatted"/>
+        <w:bidi/>
         <w:ind w:left="720"/>
         <w:rPr>
           <w:rStyle w:val="HTMLCode"/>
@@ -5101,6 +5244,7 @@
     <w:p>
       <w:pPr>
         <w:pStyle w:val="HTMLPreformatted"/>
+        <w:bidi/>
         <w:ind w:left="720"/>
         <w:rPr>
           <w:rStyle w:val="HTMLCode"/>
@@ -5142,6 +5286,7 @@
           <w:ilvl w:val="0"/>
           <w:numId w:val="6"/>
         </w:numPr>
+        <w:bidi/>
       </w:pPr>
       <w:r>
         <w:rPr>
@@ -5181,15 +5326,19 @@
       </w:r>
     </w:p>
     <w:p>
+      <w:pPr>
+        <w:bidi/>
+      </w:pPr>
       <w:r>
         <w:pict w14:anchorId="2CCC5C2D">
-          <v:rect id="_x0000_i1050" style="width:0;height:1.5pt" o:hralign="center" o:hrstd="t" o:hr="t" fillcolor="#a0a0a0" stroked="f"/>
+          <v:rect id="_x0000_i1029" style="width:0;height:1.5pt" o:hralign="right" o:hrstd="t" o:hr="t" fillcolor="#a0a0a0" stroked="f"/>
         </w:pict>
       </w:r>
     </w:p>
     <w:p>
       <w:pPr>
         <w:pStyle w:val="Heading2"/>
+        <w:bidi/>
       </w:pPr>
       <w:r>
         <w:t xml:space="preserve">## </w:t>
@@ -5204,6 +5353,7 @@
     <w:p>
       <w:pPr>
         <w:pStyle w:val="NormalWeb"/>
+        <w:bidi/>
       </w:pPr>
       <w:r>
         <w:rPr>
@@ -5261,6 +5411,7 @@
           <w:ilvl w:val="0"/>
           <w:numId w:val="7"/>
         </w:numPr>
+        <w:bidi/>
       </w:pPr>
       <w:r>
         <w:rPr>
@@ -5279,6 +5430,7 @@
           <w:ilvl w:val="0"/>
           <w:numId w:val="7"/>
         </w:numPr>
+        <w:bidi/>
       </w:pPr>
       <w:r>
         <w:rPr>
@@ -5297,6 +5449,7 @@
           <w:ilvl w:val="0"/>
           <w:numId w:val="7"/>
         </w:numPr>
+        <w:bidi/>
       </w:pPr>
       <w:r>
         <w:rPr>
@@ -5311,6 +5464,7 @@
     <w:p>
       <w:pPr>
         <w:pStyle w:val="NormalWeb"/>
+        <w:bidi/>
         <w:rPr>
           <w:rtl/>
         </w:rPr>
@@ -5375,23 +5529,26 @@
     <w:p>
       <w:pPr>
         <w:pStyle w:val="NormalWeb"/>
-      </w:pPr>
-    </w:p>
-    <w:p>
-      <w:pPr>
+        <w:bidi/>
+      </w:pPr>
+    </w:p>
+    <w:p>
+      <w:pPr>
+        <w:bidi/>
         <w:rPr>
           <w:rtl/>
         </w:rPr>
       </w:pPr>
       <w:r>
         <w:pict w14:anchorId="04066387">
-          <v:rect id="_x0000_i1033" style="width:0;height:1.5pt" o:hralign="center" o:hrstd="t" o:hr="t" fillcolor="#a0a0a0" stroked="f"/>
+          <v:rect id="_x0000_i1030" style="width:0;height:1.5pt" o:hralign="right" o:hrstd="t" o:hr="t" fillcolor="#a0a0a0" stroked="f"/>
         </w:pict>
       </w:r>
     </w:p>
     <w:p>
       <w:pPr>
         <w:pStyle w:val="Heading1"/>
+        <w:bidi/>
         <w:rPr>
           <w:rFonts w:eastAsia="Times New Roman"/>
           <w:b/>
@@ -5454,6 +5611,7 @@
     </w:p>
     <w:p>
       <w:pPr>
+        <w:bidi/>
         <w:spacing w:before="100" w:beforeAutospacing="1" w:after="100" w:afterAutospacing="1" w:line="240" w:lineRule="auto"/>
         <w:outlineLvl w:val="1"/>
         <w:rPr>
@@ -5509,6 +5667,7 @@
     </w:p>
     <w:p>
       <w:pPr>
+        <w:bidi/>
         <w:spacing w:before="100" w:beforeAutospacing="1" w:after="100" w:afterAutospacing="1" w:line="240" w:lineRule="auto"/>
         <w:rPr>
           <w:rFonts w:ascii="Times New Roman" w:eastAsia="Times New Roman" w:hAnsi="Times New Roman" w:cs="Times New Roman"/>
@@ -5680,6 +5839,7 @@
     </w:p>
     <w:p>
       <w:pPr>
+        <w:bidi/>
         <w:spacing w:before="100" w:beforeAutospacing="1" w:after="100" w:afterAutospacing="1" w:line="240" w:lineRule="auto"/>
         <w:rPr>
           <w:rFonts w:ascii="Times New Roman" w:eastAsia="Times New Roman" w:hAnsi="Times New Roman" w:cs="Times New Roman"/>
@@ -5736,6 +5896,7 @@
     </w:p>
     <w:p>
       <w:pPr>
+        <w:bidi/>
         <w:spacing w:after="0" w:line="240" w:lineRule="auto"/>
         <w:rPr>
           <w:rFonts w:ascii="Times New Roman" w:eastAsia="Times New Roman" w:hAnsi="Times New Roman" w:cs="Times New Roman"/>
@@ -5750,12 +5911,13 @@
           <w:szCs w:val="24"/>
         </w:rPr>
         <w:pict w14:anchorId="44ACF315">
-          <v:rect id="_x0000_i1043" style="width:0;height:1.5pt" o:hralign="center" o:hrstd="t" o:hr="t" fillcolor="#a0a0a0" stroked="f"/>
+          <v:rect id="_x0000_i1031" style="width:0;height:1.5pt" o:hralign="right" o:hrstd="t" o:hr="t" fillcolor="#a0a0a0" stroked="f"/>
         </w:pict>
       </w:r>
     </w:p>
     <w:p>
       <w:pPr>
+        <w:bidi/>
         <w:spacing w:before="100" w:beforeAutospacing="1" w:after="100" w:afterAutospacing="1" w:line="240" w:lineRule="auto"/>
         <w:outlineLvl w:val="1"/>
         <w:rPr>
@@ -5790,6 +5952,7 @@
     </w:p>
     <w:p>
       <w:pPr>
+        <w:bidi/>
         <w:spacing w:before="100" w:beforeAutospacing="1" w:after="100" w:afterAutospacing="1" w:line="240" w:lineRule="auto"/>
         <w:outlineLvl w:val="2"/>
         <w:rPr>
@@ -5888,6 +6051,7 @@
     </w:p>
     <w:p>
       <w:pPr>
+        <w:bidi/>
         <w:spacing w:before="100" w:beforeAutospacing="1" w:after="100" w:afterAutospacing="1" w:line="240" w:lineRule="auto"/>
         <w:rPr>
           <w:rFonts w:ascii="Times New Roman" w:eastAsia="Times New Roman" w:hAnsi="Times New Roman" w:cs="Times New Roman"/>
@@ -5915,6 +6079,7 @@
     </w:p>
     <w:p>
       <w:pPr>
+        <w:bidi/>
         <w:spacing w:before="100" w:beforeAutospacing="1" w:after="100" w:afterAutospacing="1" w:line="240" w:lineRule="auto"/>
         <w:outlineLvl w:val="2"/>
         <w:rPr>
@@ -6022,6 +6187,7 @@
     </w:p>
     <w:p>
       <w:pPr>
+        <w:bidi/>
         <w:spacing w:before="100" w:beforeAutospacing="1" w:after="100" w:afterAutospacing="1" w:line="240" w:lineRule="auto"/>
         <w:rPr>
           <w:rFonts w:ascii="Times New Roman" w:eastAsia="Times New Roman" w:hAnsi="Times New Roman" w:cs="Times New Roman"/>
@@ -6070,6 +6236,7 @@
           <w:ilvl w:val="0"/>
           <w:numId w:val="1"/>
         </w:numPr>
+        <w:bidi/>
         <w:spacing w:before="100" w:beforeAutospacing="1" w:after="100" w:afterAutospacing="1" w:line="240" w:lineRule="auto"/>
         <w:rPr>
           <w:rFonts w:ascii="Times New Roman" w:eastAsia="Times New Roman" w:hAnsi="Times New Roman" w:cs="Times New Roman"/>
@@ -6126,6 +6293,7 @@
           <w:ilvl w:val="1"/>
           <w:numId w:val="1"/>
         </w:numPr>
+        <w:bidi/>
         <w:spacing w:before="100" w:beforeAutospacing="1" w:after="100" w:afterAutospacing="1" w:line="240" w:lineRule="auto"/>
         <w:rPr>
           <w:rFonts w:ascii="Times New Roman" w:eastAsia="Times New Roman" w:hAnsi="Times New Roman" w:cs="Times New Roman"/>
@@ -6206,6 +6374,7 @@
           <w:ilvl w:val="1"/>
           <w:numId w:val="1"/>
         </w:numPr>
+        <w:bidi/>
         <w:spacing w:before="100" w:beforeAutospacing="1" w:after="100" w:afterAutospacing="1" w:line="240" w:lineRule="auto"/>
         <w:rPr>
           <w:rFonts w:ascii="Times New Roman" w:eastAsia="Times New Roman" w:hAnsi="Times New Roman" w:cs="Times New Roman"/>
@@ -6314,6 +6483,7 @@
           <w:ilvl w:val="1"/>
           <w:numId w:val="1"/>
         </w:numPr>
+        <w:bidi/>
         <w:spacing w:before="100" w:beforeAutospacing="1" w:after="100" w:afterAutospacing="1" w:line="240" w:lineRule="auto"/>
         <w:rPr>
           <w:rFonts w:ascii="Times New Roman" w:eastAsia="Times New Roman" w:hAnsi="Times New Roman" w:cs="Times New Roman"/>
@@ -6437,6 +6607,7 @@
           <w:ilvl w:val="0"/>
           <w:numId w:val="1"/>
         </w:numPr>
+        <w:bidi/>
         <w:spacing w:before="100" w:beforeAutospacing="1" w:after="100" w:afterAutospacing="1" w:line="240" w:lineRule="auto"/>
         <w:rPr>
           <w:rFonts w:ascii="Times New Roman" w:eastAsia="Times New Roman" w:hAnsi="Times New Roman" w:cs="Times New Roman"/>
@@ -6471,6 +6642,7 @@
           <w:ilvl w:val="1"/>
           <w:numId w:val="1"/>
         </w:numPr>
+        <w:bidi/>
         <w:spacing w:before="100" w:beforeAutospacing="1" w:after="100" w:afterAutospacing="1" w:line="240" w:lineRule="auto"/>
         <w:rPr>
           <w:rFonts w:ascii="Times New Roman" w:eastAsia="Times New Roman" w:hAnsi="Times New Roman" w:cs="Times New Roman"/>
@@ -6576,6 +6748,7 @@
           <w:ilvl w:val="1"/>
           <w:numId w:val="1"/>
         </w:numPr>
+        <w:bidi/>
         <w:spacing w:before="100" w:beforeAutospacing="1" w:after="100" w:afterAutospacing="1" w:line="240" w:lineRule="auto"/>
         <w:rPr>
           <w:rFonts w:ascii="Times New Roman" w:eastAsia="Times New Roman" w:hAnsi="Times New Roman" w:cs="Times New Roman"/>
@@ -6684,6 +6857,7 @@
           <w:ilvl w:val="1"/>
           <w:numId w:val="1"/>
         </w:numPr>
+        <w:bidi/>
         <w:spacing w:before="100" w:beforeAutospacing="1" w:after="100" w:afterAutospacing="1" w:line="240" w:lineRule="auto"/>
         <w:rPr>
           <w:rFonts w:ascii="Times New Roman" w:eastAsia="Times New Roman" w:hAnsi="Times New Roman" w:cs="Times New Roman"/>
@@ -6771,6 +6945,7 @@
           <w:ilvl w:val="0"/>
           <w:numId w:val="1"/>
         </w:numPr>
+        <w:bidi/>
         <w:spacing w:before="100" w:beforeAutospacing="1" w:after="100" w:afterAutospacing="1" w:line="240" w:lineRule="auto"/>
         <w:rPr>
           <w:rFonts w:ascii="Times New Roman" w:eastAsia="Times New Roman" w:hAnsi="Times New Roman" w:cs="Times New Roman"/>
@@ -6912,6 +7087,7 @@
     </w:p>
     <w:p>
       <w:pPr>
+        <w:bidi/>
         <w:spacing w:after="0" w:line="240" w:lineRule="auto"/>
         <w:rPr>
           <w:rFonts w:ascii="Times New Roman" w:eastAsia="Times New Roman" w:hAnsi="Times New Roman" w:cs="Times New Roman"/>
@@ -6926,12 +7102,13 @@
           <w:szCs w:val="24"/>
         </w:rPr>
         <w:pict w14:anchorId="39F644F8">
-          <v:rect id="_x0000_i1044" style="width:0;height:1.5pt" o:hralign="center" o:hrstd="t" o:hr="t" fillcolor="#a0a0a0" stroked="f"/>
+          <v:rect id="_x0000_i1032" style="width:0;height:1.5pt" o:hralign="right" o:hrstd="t" o:hr="t" fillcolor="#a0a0a0" stroked="f"/>
         </w:pict>
       </w:r>
     </w:p>
     <w:p>
       <w:pPr>
+        <w:bidi/>
         <w:spacing w:before="100" w:beforeAutospacing="1" w:after="100" w:afterAutospacing="1" w:line="240" w:lineRule="auto"/>
         <w:outlineLvl w:val="1"/>
         <w:rPr>
@@ -6966,6 +7143,7 @@
     </w:p>
     <w:p>
       <w:pPr>
+        <w:bidi/>
         <w:spacing w:before="100" w:beforeAutospacing="1" w:after="100" w:afterAutospacing="1" w:line="240" w:lineRule="auto"/>
         <w:rPr>
           <w:rFonts w:ascii="Times New Roman" w:eastAsia="Times New Roman" w:hAnsi="Times New Roman" w:cs="Times New Roman"/>
@@ -6993,6 +7171,7 @@
     </w:p>
     <w:p>
       <w:pPr>
+        <w:bidi/>
         <w:spacing w:before="100" w:beforeAutospacing="1" w:after="100" w:afterAutospacing="1" w:line="240" w:lineRule="auto"/>
         <w:outlineLvl w:val="2"/>
         <w:rPr>
@@ -7094,6 +7273,7 @@
           <w:ilvl w:val="0"/>
           <w:numId w:val="2"/>
         </w:numPr>
+        <w:bidi/>
         <w:spacing w:before="100" w:beforeAutospacing="1" w:after="100" w:afterAutospacing="1" w:line="240" w:lineRule="auto"/>
         <w:rPr>
           <w:rFonts w:ascii="Times New Roman" w:eastAsia="Times New Roman" w:hAnsi="Times New Roman" w:cs="Times New Roman"/>
@@ -7188,6 +7368,7 @@
           <w:ilvl w:val="0"/>
           <w:numId w:val="2"/>
         </w:numPr>
+        <w:bidi/>
         <w:spacing w:before="100" w:beforeAutospacing="1" w:after="100" w:afterAutospacing="1" w:line="240" w:lineRule="auto"/>
         <w:rPr>
           <w:rFonts w:ascii="Times New Roman" w:eastAsia="Times New Roman" w:hAnsi="Times New Roman" w:cs="Times New Roman"/>
@@ -7244,6 +7425,7 @@
     </w:p>
     <w:p>
       <w:pPr>
+        <w:bidi/>
         <w:spacing w:beforeAutospacing="1" w:after="0" w:afterAutospacing="1" w:line="240" w:lineRule="auto"/>
         <w:ind w:left="720"/>
         <w:rPr>
@@ -7281,6 +7463,7 @@
           <w:tab w:val="left" w:pos="13740"/>
           <w:tab w:val="left" w:pos="14656"/>
         </w:tabs>
+        <w:bidi/>
         <w:spacing w:after="0" w:line="240" w:lineRule="auto"/>
         <w:ind w:left="720"/>
         <w:rPr>
@@ -7336,6 +7519,7 @@
           <w:tab w:val="left" w:pos="13740"/>
           <w:tab w:val="left" w:pos="14656"/>
         </w:tabs>
+        <w:bidi/>
         <w:spacing w:after="0" w:line="240" w:lineRule="auto"/>
         <w:ind w:left="720"/>
         <w:rPr>
@@ -7387,6 +7571,7 @@
           <w:ilvl w:val="0"/>
           <w:numId w:val="2"/>
         </w:numPr>
+        <w:bidi/>
         <w:spacing w:before="100" w:beforeAutospacing="1" w:after="100" w:afterAutospacing="1" w:line="240" w:lineRule="auto"/>
         <w:rPr>
           <w:rFonts w:ascii="Times New Roman" w:eastAsia="Times New Roman" w:hAnsi="Times New Roman" w:cs="Times New Roman"/>
@@ -7459,6 +7644,7 @@
     </w:p>
     <w:p>
       <w:pPr>
+        <w:bidi/>
         <w:spacing w:before="100" w:beforeAutospacing="1" w:after="100" w:afterAutospacing="1" w:line="240" w:lineRule="auto"/>
         <w:outlineLvl w:val="2"/>
         <w:rPr>
@@ -7583,6 +7769,7 @@
           <w:ilvl w:val="0"/>
           <w:numId w:val="3"/>
         </w:numPr>
+        <w:bidi/>
         <w:spacing w:before="100" w:beforeAutospacing="1" w:after="100" w:afterAutospacing="1" w:line="240" w:lineRule="auto"/>
         <w:rPr>
           <w:rFonts w:ascii="Times New Roman" w:eastAsia="Times New Roman" w:hAnsi="Times New Roman" w:cs="Times New Roman"/>
@@ -7678,6 +7865,7 @@
           <w:ilvl w:val="0"/>
           <w:numId w:val="3"/>
         </w:numPr>
+        <w:bidi/>
         <w:spacing w:before="100" w:beforeAutospacing="1" w:after="100" w:afterAutospacing="1" w:line="240" w:lineRule="auto"/>
         <w:rPr>
           <w:rFonts w:ascii="Times New Roman" w:eastAsia="Times New Roman" w:hAnsi="Times New Roman" w:cs="Times New Roman"/>
@@ -7734,6 +7922,7 @@
     </w:p>
     <w:p>
       <w:pPr>
+        <w:bidi/>
         <w:spacing w:beforeAutospacing="1" w:after="0" w:afterAutospacing="1" w:line="240" w:lineRule="auto"/>
         <w:ind w:left="720"/>
         <w:rPr>
@@ -7771,6 +7960,7 @@
           <w:tab w:val="left" w:pos="13740"/>
           <w:tab w:val="left" w:pos="14656"/>
         </w:tabs>
+        <w:bidi/>
         <w:spacing w:after="0" w:line="240" w:lineRule="auto"/>
         <w:ind w:left="720"/>
         <w:rPr>
@@ -7826,6 +8016,7 @@
           <w:tab w:val="left" w:pos="13740"/>
           <w:tab w:val="left" w:pos="14656"/>
         </w:tabs>
+        <w:bidi/>
         <w:spacing w:after="0" w:line="240" w:lineRule="auto"/>
         <w:ind w:left="720"/>
         <w:rPr>
@@ -7887,6 +8078,7 @@
           <w:ilvl w:val="0"/>
           <w:numId w:val="3"/>
         </w:numPr>
+        <w:bidi/>
         <w:spacing w:before="100" w:beforeAutospacing="1" w:after="100" w:afterAutospacing="1" w:line="240" w:lineRule="auto"/>
         <w:rPr>
           <w:rFonts w:ascii="Times New Roman" w:eastAsia="Times New Roman" w:hAnsi="Times New Roman" w:cs="Times New Roman"/>
@@ -7977,6 +8169,7 @@
     </w:p>
     <w:p>
       <w:pPr>
+        <w:bidi/>
         <w:spacing w:after="0" w:line="240" w:lineRule="auto"/>
         <w:rPr>
           <w:rFonts w:ascii="Times New Roman" w:eastAsia="Times New Roman" w:hAnsi="Times New Roman" w:cs="Times New Roman"/>
@@ -7991,13 +8184,14 @@
           <w:szCs w:val="24"/>
         </w:rPr>
         <w:pict w14:anchorId="37C0BDDA">
-          <v:rect id="_x0000_i1045" style="width:0;height:1.5pt" o:hralign="center" o:hrstd="t" o:hr="t" fillcolor="#a0a0a0" stroked="f"/>
+          <v:rect id="_x0000_i1033" style="width:0;height:1.5pt" o:hralign="right" o:hrstd="t" o:hr="t" fillcolor="#a0a0a0" stroked="f"/>
         </w:pict>
       </w:r>
     </w:p>
     <w:p>
       <w:pPr>
         <w:pStyle w:val="Heading2"/>
+        <w:bidi/>
       </w:pPr>
       <w:r>
         <w:rPr>
@@ -8011,6 +8205,7 @@
     </w:p>
     <w:p>
       <w:pPr>
+        <w:bidi/>
         <w:spacing w:before="100" w:beforeAutospacing="1" w:after="100" w:afterAutospacing="1" w:line="240" w:lineRule="auto"/>
         <w:rPr>
           <w:rFonts w:ascii="Times New Roman" w:eastAsia="Times New Roman" w:hAnsi="Times New Roman" w:cs="Times New Roman"/>
@@ -8055,6 +8250,7 @@
     </w:p>
     <w:p>
       <w:pPr>
+        <w:bidi/>
         <w:rPr>
           <w:rFonts w:ascii="Times New Roman" w:eastAsia="Times New Roman" w:hAnsi="Times New Roman" w:cs="Times New Roman"/>
           <w:sz w:val="24"/>
@@ -8072,6 +8268,7 @@
     </w:p>
     <w:p>
       <w:pPr>
+        <w:bidi/>
         <w:spacing w:before="100" w:beforeAutospacing="1" w:after="100" w:afterAutospacing="1" w:line="240" w:lineRule="auto"/>
         <w:outlineLvl w:val="1"/>
         <w:rPr>
@@ -8139,6 +8336,7 @@
     </w:p>
     <w:p>
       <w:pPr>
+        <w:bidi/>
         <w:spacing w:before="100" w:beforeAutospacing="1" w:after="100" w:afterAutospacing="1" w:line="240" w:lineRule="auto"/>
         <w:outlineLvl w:val="2"/>
         <w:rPr>
@@ -8198,6 +8396,7 @@
           <w:ilvl w:val="0"/>
           <w:numId w:val="16"/>
         </w:numPr>
+        <w:bidi/>
         <w:spacing w:before="100" w:beforeAutospacing="1" w:after="100" w:afterAutospacing="1" w:line="240" w:lineRule="auto"/>
         <w:rPr>
           <w:rFonts w:ascii="Times New Roman" w:eastAsia="Times New Roman" w:hAnsi="Times New Roman" w:cs="Times New Roman"/>
@@ -8312,6 +8511,7 @@
           <w:ilvl w:val="0"/>
           <w:numId w:val="16"/>
         </w:numPr>
+        <w:bidi/>
         <w:spacing w:before="100" w:beforeAutospacing="1" w:after="100" w:afterAutospacing="1" w:line="240" w:lineRule="auto"/>
         <w:rPr>
           <w:rFonts w:ascii="Times New Roman" w:eastAsia="Times New Roman" w:hAnsi="Times New Roman" w:cs="Times New Roman"/>
@@ -8347,6 +8547,7 @@
           <w:ilvl w:val="1"/>
           <w:numId w:val="16"/>
         </w:numPr>
+        <w:bidi/>
         <w:spacing w:before="100" w:beforeAutospacing="1" w:after="100" w:afterAutospacing="1" w:line="240" w:lineRule="auto"/>
         <w:rPr>
           <w:rFonts w:ascii="Times New Roman" w:eastAsia="Times New Roman" w:hAnsi="Times New Roman" w:cs="Times New Roman"/>
@@ -8496,6 +8697,7 @@
           <w:ilvl w:val="1"/>
           <w:numId w:val="16"/>
         </w:numPr>
+        <w:bidi/>
         <w:spacing w:before="100" w:beforeAutospacing="1" w:after="100" w:afterAutospacing="1" w:line="240" w:lineRule="auto"/>
         <w:rPr>
           <w:rFonts w:ascii="Times New Roman" w:eastAsia="Times New Roman" w:hAnsi="Times New Roman" w:cs="Times New Roman"/>
@@ -8647,6 +8849,7 @@
           <w:ilvl w:val="1"/>
           <w:numId w:val="16"/>
         </w:numPr>
+        <w:bidi/>
         <w:spacing w:before="100" w:beforeAutospacing="1" w:after="100" w:afterAutospacing="1" w:line="240" w:lineRule="auto"/>
         <w:rPr>
           <w:rFonts w:ascii="Times New Roman" w:eastAsia="Times New Roman" w:hAnsi="Times New Roman" w:cs="Times New Roman"/>
@@ -8845,6 +9048,7 @@
     </w:p>
     <w:p>
       <w:pPr>
+        <w:bidi/>
         <w:spacing w:after="0" w:line="240" w:lineRule="auto"/>
         <w:rPr>
           <w:rFonts w:ascii="Times New Roman" w:eastAsia="Times New Roman" w:hAnsi="Times New Roman" w:cs="Times New Roman"/>
@@ -8859,12 +9063,13 @@
           <w:szCs w:val="24"/>
         </w:rPr>
         <w:pict w14:anchorId="4EA3B1AC">
-          <v:rect id="_x0000_i1052" style="width:0;height:1.5pt" o:hralign="center" o:hrstd="t" o:hr="t" fillcolor="#a0a0a0" stroked="f"/>
+          <v:rect id="_x0000_i1034" style="width:0;height:1.5pt" o:hralign="right" o:hrstd="t" o:hr="t" fillcolor="#a0a0a0" stroked="f"/>
         </w:pict>
       </w:r>
     </w:p>
     <w:p>
       <w:pPr>
+        <w:bidi/>
         <w:spacing w:before="100" w:beforeAutospacing="1" w:after="100" w:afterAutospacing="1" w:line="240" w:lineRule="auto"/>
         <w:outlineLvl w:val="2"/>
         <w:rPr>
@@ -8924,6 +9129,7 @@
           <w:ilvl w:val="0"/>
           <w:numId w:val="17"/>
         </w:numPr>
+        <w:bidi/>
         <w:spacing w:before="100" w:beforeAutospacing="1" w:after="100" w:afterAutospacing="1" w:line="240" w:lineRule="auto"/>
         <w:rPr>
           <w:rFonts w:ascii="Times New Roman" w:eastAsia="Times New Roman" w:hAnsi="Times New Roman" w:cs="Times New Roman"/>
@@ -8984,6 +9190,7 @@
           <w:ilvl w:val="0"/>
           <w:numId w:val="17"/>
         </w:numPr>
+        <w:bidi/>
         <w:spacing w:before="100" w:beforeAutospacing="1" w:after="100" w:afterAutospacing="1" w:line="240" w:lineRule="auto"/>
         <w:rPr>
           <w:rFonts w:ascii="Times New Roman" w:eastAsia="Times New Roman" w:hAnsi="Times New Roman" w:cs="Times New Roman"/>
@@ -9111,6 +9318,7 @@
     </w:p>
     <w:p>
       <w:pPr>
+        <w:bidi/>
         <w:spacing w:after="0" w:line="240" w:lineRule="auto"/>
         <w:rPr>
           <w:rFonts w:ascii="Times New Roman" w:eastAsia="Times New Roman" w:hAnsi="Times New Roman" w:cs="Times New Roman"/>
@@ -9125,12 +9333,13 @@
           <w:szCs w:val="24"/>
         </w:rPr>
         <w:pict w14:anchorId="78E3EB4C">
-          <v:rect id="_x0000_i1053" style="width:0;height:1.5pt" o:hralign="center" o:hrstd="t" o:hr="t" fillcolor="#a0a0a0" stroked="f"/>
+          <v:rect id="_x0000_i1035" style="width:0;height:1.5pt" o:hralign="right" o:hrstd="t" o:hr="t" fillcolor="#a0a0a0" stroked="f"/>
         </w:pict>
       </w:r>
     </w:p>
     <w:p>
       <w:pPr>
+        <w:bidi/>
         <w:spacing w:before="100" w:beforeAutospacing="1" w:after="100" w:afterAutospacing="1" w:line="240" w:lineRule="auto"/>
         <w:outlineLvl w:val="2"/>
         <w:rPr>
@@ -9190,6 +9399,7 @@
           <w:ilvl w:val="0"/>
           <w:numId w:val="18"/>
         </w:numPr>
+        <w:bidi/>
         <w:spacing w:before="100" w:beforeAutospacing="1" w:after="100" w:afterAutospacing="1" w:line="240" w:lineRule="auto"/>
         <w:rPr>
           <w:rFonts w:ascii="Times New Roman" w:eastAsia="Times New Roman" w:hAnsi="Times New Roman" w:cs="Times New Roman"/>
@@ -9250,6 +9460,7 @@
           <w:ilvl w:val="0"/>
           <w:numId w:val="18"/>
         </w:numPr>
+        <w:bidi/>
         <w:spacing w:before="100" w:beforeAutospacing="1" w:after="100" w:afterAutospacing="1" w:line="240" w:lineRule="auto"/>
         <w:rPr>
           <w:rFonts w:ascii="Times New Roman" w:eastAsia="Times New Roman" w:hAnsi="Times New Roman" w:cs="Times New Roman"/>
@@ -9285,6 +9496,7 @@
           <w:ilvl w:val="1"/>
           <w:numId w:val="18"/>
         </w:numPr>
+        <w:bidi/>
         <w:spacing w:before="100" w:beforeAutospacing="1" w:after="100" w:afterAutospacing="1" w:line="240" w:lineRule="auto"/>
         <w:rPr>
           <w:rFonts w:ascii="Times New Roman" w:eastAsia="Times New Roman" w:hAnsi="Times New Roman" w:cs="Times New Roman"/>
@@ -9405,6 +9617,7 @@
           <w:ilvl w:val="1"/>
           <w:numId w:val="18"/>
         </w:numPr>
+        <w:bidi/>
         <w:spacing w:before="100" w:beforeAutospacing="1" w:after="100" w:afterAutospacing="1" w:line="240" w:lineRule="auto"/>
         <w:rPr>
           <w:rFonts w:ascii="Times New Roman" w:eastAsia="Times New Roman" w:hAnsi="Times New Roman" w:cs="Times New Roman"/>
@@ -9555,6 +9768,7 @@
     </w:p>
     <w:p>
       <w:pPr>
+        <w:bidi/>
         <w:spacing w:after="0" w:line="240" w:lineRule="auto"/>
         <w:rPr>
           <w:rFonts w:ascii="Times New Roman" w:eastAsia="Times New Roman" w:hAnsi="Times New Roman" w:cs="Times New Roman"/>
@@ -9569,12 +9783,13 @@
           <w:szCs w:val="24"/>
         </w:rPr>
         <w:pict w14:anchorId="5AC6BE51">
-          <v:rect id="_x0000_i1054" style="width:0;height:1.5pt" o:hralign="center" o:hrstd="t" o:hr="t" fillcolor="#a0a0a0" stroked="f"/>
+          <v:rect id="_x0000_i1036" style="width:0;height:1.5pt" o:hralign="right" o:hrstd="t" o:hr="t" fillcolor="#a0a0a0" stroked="f"/>
         </w:pict>
       </w:r>
     </w:p>
     <w:p>
       <w:pPr>
+        <w:bidi/>
         <w:spacing w:before="100" w:beforeAutospacing="1" w:after="100" w:afterAutospacing="1" w:line="240" w:lineRule="auto"/>
         <w:outlineLvl w:val="2"/>
         <w:rPr>
@@ -9634,6 +9849,7 @@
           <w:ilvl w:val="0"/>
           <w:numId w:val="19"/>
         </w:numPr>
+        <w:bidi/>
         <w:spacing w:before="100" w:beforeAutospacing="1" w:after="100" w:afterAutospacing="1" w:line="240" w:lineRule="auto"/>
         <w:rPr>
           <w:rFonts w:ascii="Times New Roman" w:eastAsia="Times New Roman" w:hAnsi="Times New Roman" w:cs="Times New Roman"/>
@@ -9695,6 +9911,7 @@
           <w:ilvl w:val="0"/>
           <w:numId w:val="19"/>
         </w:numPr>
+        <w:bidi/>
         <w:spacing w:before="100" w:beforeAutospacing="1" w:after="100" w:afterAutospacing="1" w:line="240" w:lineRule="auto"/>
         <w:rPr>
           <w:rFonts w:ascii="Times New Roman" w:eastAsia="Times New Roman" w:hAnsi="Times New Roman" w:cs="Times New Roman"/>
@@ -9877,6 +10094,7 @@
     </w:p>
     <w:p>
       <w:pPr>
+        <w:bidi/>
         <w:spacing w:after="0" w:line="240" w:lineRule="auto"/>
         <w:rPr>
           <w:rFonts w:ascii="Times New Roman" w:eastAsia="Times New Roman" w:hAnsi="Times New Roman" w:cs="Times New Roman"/>
@@ -9891,12 +10109,13 @@
           <w:szCs w:val="24"/>
         </w:rPr>
         <w:pict w14:anchorId="157FFF12">
-          <v:rect id="_x0000_i1055" style="width:0;height:1.5pt" o:hralign="center" o:hrstd="t" o:hr="t" fillcolor="#a0a0a0" stroked="f"/>
+          <v:rect id="_x0000_i1037" style="width:0;height:1.5pt" o:hralign="right" o:hrstd="t" o:hr="t" fillcolor="#a0a0a0" stroked="f"/>
         </w:pict>
       </w:r>
     </w:p>
     <w:p>
       <w:pPr>
+        <w:bidi/>
         <w:spacing w:before="100" w:beforeAutospacing="1" w:after="100" w:afterAutospacing="1" w:line="240" w:lineRule="auto"/>
         <w:outlineLvl w:val="2"/>
         <w:rPr>
@@ -9962,6 +10181,7 @@
     </w:p>
     <w:p>
       <w:pPr>
+        <w:bidi/>
         <w:spacing w:before="100" w:beforeAutospacing="1" w:after="100" w:afterAutospacing="1" w:line="240" w:lineRule="auto"/>
         <w:rPr>
           <w:rFonts w:ascii="Times New Roman" w:eastAsia="Times New Roman" w:hAnsi="Times New Roman" w:cs="Times New Roman"/>
@@ -10052,6 +10272,7 @@
           <w:ilvl w:val="0"/>
           <w:numId w:val="20"/>
         </w:numPr>
+        <w:bidi/>
         <w:spacing w:before="100" w:beforeAutospacing="1" w:after="100" w:afterAutospacing="1" w:line="240" w:lineRule="auto"/>
         <w:rPr>
           <w:rFonts w:ascii="Times New Roman" w:eastAsia="Times New Roman" w:hAnsi="Times New Roman" w:cs="Times New Roman"/>
@@ -10234,6 +10455,7 @@
           <w:ilvl w:val="0"/>
           <w:numId w:val="20"/>
         </w:numPr>
+        <w:bidi/>
         <w:spacing w:before="100" w:beforeAutospacing="1" w:after="100" w:afterAutospacing="1" w:line="240" w:lineRule="auto"/>
         <w:rPr>
           <w:rFonts w:ascii="Times New Roman" w:eastAsia="Times New Roman" w:hAnsi="Times New Roman" w:cs="Times New Roman"/>
@@ -10276,6 +10498,7 @@
           <w:ilvl w:val="1"/>
           <w:numId w:val="20"/>
         </w:numPr>
+        <w:bidi/>
         <w:spacing w:before="100" w:beforeAutospacing="1" w:after="100" w:afterAutospacing="1" w:line="240" w:lineRule="auto"/>
         <w:rPr>
           <w:rFonts w:ascii="Times New Roman" w:eastAsia="Times New Roman" w:hAnsi="Times New Roman" w:cs="Times New Roman"/>
@@ -10340,6 +10563,7 @@
           <w:ilvl w:val="1"/>
           <w:numId w:val="20"/>
         </w:numPr>
+        <w:bidi/>
         <w:spacing w:before="100" w:beforeAutospacing="1" w:after="100" w:afterAutospacing="1" w:line="240" w:lineRule="auto"/>
         <w:rPr>
           <w:rFonts w:ascii="Times New Roman" w:eastAsia="Times New Roman" w:hAnsi="Times New Roman" w:cs="Times New Roman"/>
@@ -10404,6 +10628,7 @@
           <w:ilvl w:val="1"/>
           <w:numId w:val="20"/>
         </w:numPr>
+        <w:bidi/>
         <w:spacing w:before="100" w:beforeAutospacing="1" w:after="100" w:afterAutospacing="1" w:line="240" w:lineRule="auto"/>
         <w:rPr>
           <w:rFonts w:ascii="Times New Roman" w:eastAsia="Times New Roman" w:hAnsi="Times New Roman" w:cs="Times New Roman"/>
@@ -10496,6 +10721,7 @@
           <w:ilvl w:val="1"/>
           <w:numId w:val="20"/>
         </w:numPr>
+        <w:bidi/>
         <w:spacing w:before="100" w:beforeAutospacing="1" w:after="100" w:afterAutospacing="1" w:line="240" w:lineRule="auto"/>
         <w:rPr>
           <w:rFonts w:ascii="Times New Roman" w:eastAsia="Times New Roman" w:hAnsi="Times New Roman" w:cs="Times New Roman"/>
@@ -10578,6 +10804,7 @@
           <w:ilvl w:val="0"/>
           <w:numId w:val="20"/>
         </w:numPr>
+        <w:bidi/>
         <w:spacing w:before="100" w:beforeAutospacing="1" w:after="100" w:afterAutospacing="1" w:line="240" w:lineRule="auto"/>
         <w:rPr>
           <w:rFonts w:ascii="Times New Roman" w:eastAsia="Times New Roman" w:hAnsi="Times New Roman" w:cs="Times New Roman"/>
@@ -10688,6 +10915,7 @@
     </w:p>
     <w:p>
       <w:pPr>
+        <w:bidi/>
         <w:spacing w:after="0" w:line="240" w:lineRule="auto"/>
         <w:rPr>
           <w:rFonts w:ascii="Times New Roman" w:eastAsia="Times New Roman" w:hAnsi="Times New Roman" w:cs="Times New Roman"/>
@@ -10702,12 +10930,13 @@
           <w:szCs w:val="24"/>
         </w:rPr>
         <w:pict w14:anchorId="6A69209D">
-          <v:rect id="_x0000_i1056" style="width:0;height:1.5pt" o:hralign="center" o:hrstd="t" o:hr="t" fillcolor="#a0a0a0" stroked="f"/>
+          <v:rect id="_x0000_i1038" style="width:0;height:1.5pt" o:hralign="right" o:hrstd="t" o:hr="t" fillcolor="#a0a0a0" stroked="f"/>
         </w:pict>
       </w:r>
     </w:p>
     <w:p>
       <w:pPr>
+        <w:bidi/>
         <w:spacing w:before="100" w:beforeAutospacing="1" w:after="100" w:afterAutospacing="1" w:line="240" w:lineRule="auto"/>
         <w:outlineLvl w:val="2"/>
         <w:rPr>
@@ -10789,6 +11018,7 @@
           <w:ilvl w:val="0"/>
           <w:numId w:val="21"/>
         </w:numPr>
+        <w:bidi/>
         <w:spacing w:before="100" w:beforeAutospacing="1" w:after="100" w:afterAutospacing="1" w:line="240" w:lineRule="auto"/>
         <w:rPr>
           <w:rFonts w:ascii="Times New Roman" w:eastAsia="Times New Roman" w:hAnsi="Times New Roman" w:cs="Times New Roman"/>
@@ -10924,6 +11154,7 @@
           <w:ilvl w:val="0"/>
           <w:numId w:val="21"/>
         </w:numPr>
+        <w:bidi/>
         <w:spacing w:before="100" w:beforeAutospacing="1" w:after="100" w:afterAutospacing="1" w:line="240" w:lineRule="auto"/>
         <w:rPr>
           <w:rFonts w:ascii="Times New Roman" w:eastAsia="Times New Roman" w:hAnsi="Times New Roman" w:cs="Times New Roman"/>
@@ -11039,6 +11270,7 @@
           <w:ilvl w:val="1"/>
           <w:numId w:val="21"/>
         </w:numPr>
+        <w:bidi/>
         <w:spacing w:before="100" w:beforeAutospacing="1" w:after="100" w:afterAutospacing="1" w:line="240" w:lineRule="auto"/>
         <w:rPr>
           <w:rFonts w:ascii="Times New Roman" w:eastAsia="Times New Roman" w:hAnsi="Times New Roman" w:cs="Times New Roman"/>
@@ -11099,6 +11331,7 @@
           <w:ilvl w:val="1"/>
           <w:numId w:val="21"/>
         </w:numPr>
+        <w:bidi/>
         <w:spacing w:before="100" w:beforeAutospacing="1" w:after="100" w:afterAutospacing="1" w:line="240" w:lineRule="auto"/>
         <w:rPr>
           <w:rFonts w:ascii="Times New Roman" w:eastAsia="Times New Roman" w:hAnsi="Times New Roman" w:cs="Times New Roman"/>
@@ -11167,6 +11400,7 @@
           <w:ilvl w:val="0"/>
           <w:numId w:val="21"/>
         </w:numPr>
+        <w:bidi/>
         <w:spacing w:before="100" w:beforeAutospacing="1" w:after="100" w:afterAutospacing="1" w:line="240" w:lineRule="auto"/>
         <w:rPr>
           <w:rFonts w:ascii="Times New Roman" w:eastAsia="Times New Roman" w:hAnsi="Times New Roman" w:cs="Times New Roman"/>
@@ -11194,6 +11428,7 @@
     </w:p>
     <w:p>
       <w:pPr>
+        <w:bidi/>
         <w:spacing w:before="100" w:beforeAutospacing="1" w:after="100" w:afterAutospacing="1" w:line="240" w:lineRule="auto"/>
         <w:rPr>
           <w:rFonts w:ascii="Times New Roman" w:eastAsia="Times New Roman" w:hAnsi="Times New Roman" w:cs="Times New Roman"/>
@@ -11204,6 +11439,7 @@
     </w:p>
     <w:p>
       <w:pPr>
+        <w:bidi/>
         <w:rPr>
           <w:rFonts w:ascii="Times New Roman" w:eastAsia="Times New Roman" w:hAnsi="Times New Roman" w:cs="Times New Roman"/>
           <w:sz w:val="24"/>
@@ -11221,22 +11457,29 @@
     </w:p>
     <w:p>
       <w:pPr>
-        <w:rPr>
-          <w:rtl/>
-        </w:rPr>
-      </w:pPr>
-    </w:p>
-    <w:p>
-      <w:pPr>
-        <w:rPr>
-          <w:rtl/>
-        </w:rPr>
-      </w:pPr>
-    </w:p>
-    <w:p/>
+        <w:bidi/>
+        <w:rPr>
+          <w:rtl/>
+        </w:rPr>
+      </w:pPr>
+    </w:p>
+    <w:p>
+      <w:pPr>
+        <w:bidi/>
+        <w:rPr>
+          <w:rtl/>
+        </w:rPr>
+      </w:pPr>
+    </w:p>
+    <w:p>
+      <w:pPr>
+        <w:bidi/>
+      </w:pPr>
+    </w:p>
     <w:p>
       <w:pPr>
         <w:pStyle w:val="Heading3"/>
+        <w:bidi/>
       </w:pPr>
       <w:r>
         <w:rPr>
@@ -11266,6 +11509,7 @@
           <w:ilvl w:val="0"/>
           <w:numId w:val="15"/>
         </w:numPr>
+        <w:bidi/>
       </w:pPr>
       <w:r>
         <w:rPr>
@@ -11302,6 +11546,7 @@
           <w:ilvl w:val="1"/>
           <w:numId w:val="15"/>
         </w:numPr>
+        <w:bidi/>
       </w:pPr>
       <w:r>
         <w:rPr>
@@ -11366,6 +11611,7 @@
           <w:ilvl w:val="0"/>
           <w:numId w:val="15"/>
         </w:numPr>
+        <w:bidi/>
       </w:pPr>
       <w:r>
         <w:rPr>
@@ -11410,6 +11656,7 @@
           <w:ilvl w:val="1"/>
           <w:numId w:val="15"/>
         </w:numPr>
+        <w:bidi/>
       </w:pPr>
       <w:r>
         <w:rPr>
@@ -11470,6 +11717,7 @@
           <w:ilvl w:val="0"/>
           <w:numId w:val="15"/>
         </w:numPr>
+        <w:bidi/>
       </w:pPr>
       <w:r>
         <w:rPr>
@@ -11514,6 +11762,7 @@
           <w:ilvl w:val="1"/>
           <w:numId w:val="15"/>
         </w:numPr>
+        <w:bidi/>
       </w:pPr>
       <w:r>
         <w:rPr>
@@ -11576,6 +11825,7 @@
           <w:ilvl w:val="0"/>
           <w:numId w:val="15"/>
         </w:numPr>
+        <w:bidi/>
       </w:pPr>
       <w:r>
         <w:rPr>
@@ -11627,6 +11877,7 @@
           <w:ilvl w:val="1"/>
           <w:numId w:val="15"/>
         </w:numPr>
+        <w:bidi/>
       </w:pPr>
       <w:r>
         <w:rPr>
@@ -11673,6 +11924,7 @@
     </w:p>
     <w:p>
       <w:pPr>
+        <w:bidi/>
         <w:rPr>
           <w:rFonts w:ascii="Times New Roman" w:eastAsia="Times New Roman" w:hAnsi="Times New Roman" w:cs="Times New Roman"/>
           <w:sz w:val="24"/>
@@ -11685,6 +11937,7 @@
     </w:p>
     <w:p>
       <w:pPr>
+        <w:bidi/>
         <w:spacing w:before="100" w:beforeAutospacing="1" w:after="100" w:afterAutospacing="1" w:line="240" w:lineRule="auto"/>
         <w:outlineLvl w:val="1"/>
         <w:rPr>
@@ -11755,6 +12008,7 @@
     </w:p>
     <w:p>
       <w:pPr>
+        <w:bidi/>
         <w:spacing w:before="100" w:beforeAutospacing="1" w:after="100" w:afterAutospacing="1" w:line="240" w:lineRule="auto"/>
         <w:rPr>
           <w:rFonts w:ascii="Times New Roman" w:eastAsia="Times New Roman" w:hAnsi="Times New Roman" w:cs="Times New Roman"/>
@@ -11786,6 +12040,7 @@
           <w:ilvl w:val="0"/>
           <w:numId w:val="29"/>
         </w:numPr>
+        <w:bidi/>
         <w:spacing w:before="100" w:beforeAutospacing="1" w:after="100" w:afterAutospacing="1" w:line="240" w:lineRule="auto"/>
         <w:rPr>
           <w:rFonts w:ascii="Times New Roman" w:eastAsia="Times New Roman" w:hAnsi="Times New Roman" w:cs="Times New Roman"/>
@@ -11866,6 +12121,7 @@
           <w:ilvl w:val="0"/>
           <w:numId w:val="29"/>
         </w:numPr>
+        <w:bidi/>
         <w:spacing w:before="100" w:beforeAutospacing="1" w:after="100" w:afterAutospacing="1" w:line="240" w:lineRule="auto"/>
         <w:rPr>
           <w:rFonts w:ascii="Times New Roman" w:eastAsia="Times New Roman" w:hAnsi="Times New Roman" w:cs="Times New Roman"/>
@@ -11948,6 +12204,7 @@
           <w:ilvl w:val="0"/>
           <w:numId w:val="29"/>
         </w:numPr>
+        <w:bidi/>
         <w:spacing w:before="100" w:beforeAutospacing="1" w:after="100" w:afterAutospacing="1" w:line="240" w:lineRule="auto"/>
         <w:rPr>
           <w:rFonts w:ascii="Times New Roman" w:eastAsia="Times New Roman" w:hAnsi="Times New Roman" w:cs="Times New Roman"/>
@@ -12037,6 +12294,7 @@
     </w:p>
     <w:p>
       <w:pPr>
+        <w:bidi/>
         <w:spacing w:before="100" w:beforeAutospacing="1" w:after="100" w:afterAutospacing="1" w:line="240" w:lineRule="auto"/>
         <w:outlineLvl w:val="2"/>
         <w:rPr>
@@ -12061,6 +12319,7 @@
     </w:p>
     <w:p>
       <w:pPr>
+        <w:bidi/>
         <w:spacing w:before="100" w:beforeAutospacing="1" w:after="100" w:afterAutospacing="1" w:line="240" w:lineRule="auto"/>
         <w:rPr>
           <w:rFonts w:ascii="Times New Roman" w:eastAsia="Times New Roman" w:hAnsi="Times New Roman" w:cs="Times New Roman"/>
@@ -12088,6 +12347,7 @@
     </w:p>
     <w:p>
       <w:pPr>
+        <w:bidi/>
         <w:spacing w:before="100" w:beforeAutospacing="1" w:after="100" w:afterAutospacing="1" w:line="240" w:lineRule="auto"/>
         <w:rPr>
           <w:rFonts w:ascii="Times New Roman" w:eastAsia="Times New Roman" w:hAnsi="Times New Roman" w:cs="Times New Roman"/>
@@ -12195,6 +12455,7 @@
     </w:p>
     <w:p>
       <w:pPr>
+        <w:bidi/>
         <w:spacing w:after="0" w:line="240" w:lineRule="auto"/>
         <w:rPr>
           <w:rFonts w:ascii="Times New Roman" w:eastAsia="Times New Roman" w:hAnsi="Times New Roman" w:cs="Times New Roman"/>
@@ -12231,6 +12492,7 @@
           <w:tab w:val="left" w:pos="13740"/>
           <w:tab w:val="left" w:pos="14656"/>
         </w:tabs>
+        <w:bidi/>
         <w:spacing w:after="0" w:line="240" w:lineRule="auto"/>
         <w:rPr>
           <w:rFonts w:ascii="Courier New" w:eastAsia="Times New Roman" w:hAnsi="Courier New" w:cs="Courier New"/>
@@ -12267,6 +12529,7 @@
           <w:tab w:val="left" w:pos="13740"/>
           <w:tab w:val="left" w:pos="14656"/>
         </w:tabs>
+        <w:bidi/>
         <w:spacing w:after="0" w:line="240" w:lineRule="auto"/>
         <w:rPr>
           <w:rFonts w:ascii="Courier New" w:eastAsia="Times New Roman" w:hAnsi="Courier New" w:cs="Courier New"/>
@@ -12357,6 +12620,7 @@
           <w:tab w:val="left" w:pos="13740"/>
           <w:tab w:val="left" w:pos="14656"/>
         </w:tabs>
+        <w:bidi/>
         <w:spacing w:after="0" w:line="240" w:lineRule="auto"/>
         <w:rPr>
           <w:rFonts w:ascii="Courier New" w:eastAsia="Times New Roman" w:hAnsi="Courier New" w:cs="Courier New"/>
@@ -12431,6 +12695,7 @@
           <w:tab w:val="left" w:pos="13740"/>
           <w:tab w:val="left" w:pos="14656"/>
         </w:tabs>
+        <w:bidi/>
         <w:spacing w:after="0" w:line="240" w:lineRule="auto"/>
         <w:rPr>
           <w:rFonts w:ascii="Courier New" w:eastAsia="Times New Roman" w:hAnsi="Courier New" w:cs="Courier New"/>
@@ -12513,6 +12778,7 @@
           <w:tab w:val="left" w:pos="13740"/>
           <w:tab w:val="left" w:pos="14656"/>
         </w:tabs>
+        <w:bidi/>
         <w:spacing w:after="0" w:line="240" w:lineRule="auto"/>
         <w:rPr>
           <w:rFonts w:ascii="Courier New" w:eastAsia="Times New Roman" w:hAnsi="Courier New" w:cs="Courier New"/>
@@ -12541,6 +12807,7 @@
           <w:tab w:val="left" w:pos="13740"/>
           <w:tab w:val="left" w:pos="14656"/>
         </w:tabs>
+        <w:bidi/>
         <w:spacing w:after="0" w:line="240" w:lineRule="auto"/>
         <w:rPr>
           <w:rFonts w:ascii="Courier New" w:eastAsia="Times New Roman" w:hAnsi="Courier New" w:cs="Courier New"/>
@@ -12595,6 +12862,7 @@
           <w:tab w:val="left" w:pos="13740"/>
           <w:tab w:val="left" w:pos="14656"/>
         </w:tabs>
+        <w:bidi/>
         <w:spacing w:after="0" w:line="240" w:lineRule="auto"/>
         <w:rPr>
           <w:rFonts w:ascii="Courier New" w:eastAsia="Times New Roman" w:hAnsi="Courier New" w:cs="Courier New"/>
@@ -12659,6 +12927,7 @@
     </w:p>
     <w:p>
       <w:pPr>
+        <w:bidi/>
         <w:spacing w:before="100" w:beforeAutospacing="1" w:after="100" w:afterAutospacing="1" w:line="240" w:lineRule="auto"/>
         <w:rPr>
           <w:rFonts w:ascii="Times New Roman" w:eastAsia="Times New Roman" w:hAnsi="Times New Roman" w:cs="Times New Roman"/>
@@ -12768,6 +13037,7 @@
     </w:p>
     <w:p>
       <w:pPr>
+        <w:bidi/>
         <w:spacing w:after="0" w:line="240" w:lineRule="auto"/>
         <w:rPr>
           <w:rFonts w:ascii="Times New Roman" w:eastAsia="Times New Roman" w:hAnsi="Times New Roman" w:cs="Times New Roman"/>
@@ -12804,6 +13074,7 @@
           <w:tab w:val="left" w:pos="13740"/>
           <w:tab w:val="left" w:pos="14656"/>
         </w:tabs>
+        <w:bidi/>
         <w:spacing w:after="0" w:line="240" w:lineRule="auto"/>
         <w:rPr>
           <w:rFonts w:ascii="Courier New" w:eastAsia="Times New Roman" w:hAnsi="Courier New" w:cs="Courier New"/>
@@ -12857,6 +13128,7 @@
           <w:tab w:val="left" w:pos="13740"/>
           <w:tab w:val="left" w:pos="14656"/>
         </w:tabs>
+        <w:bidi/>
         <w:spacing w:after="0" w:line="240" w:lineRule="auto"/>
         <w:rPr>
           <w:rFonts w:ascii="Courier New" w:eastAsia="Times New Roman" w:hAnsi="Courier New" w:cs="Courier New"/>
@@ -12921,6 +13193,7 @@
           <w:tab w:val="left" w:pos="13740"/>
           <w:tab w:val="left" w:pos="14656"/>
         </w:tabs>
+        <w:bidi/>
         <w:spacing w:after="0" w:line="240" w:lineRule="auto"/>
         <w:rPr>
           <w:rFonts w:ascii="Courier New" w:eastAsia="Times New Roman" w:hAnsi="Courier New" w:cs="Courier New"/>
@@ -13029,6 +13302,7 @@
           <w:tab w:val="left" w:pos="13740"/>
           <w:tab w:val="left" w:pos="14656"/>
         </w:tabs>
+        <w:bidi/>
         <w:spacing w:after="0" w:line="240" w:lineRule="auto"/>
         <w:rPr>
           <w:rFonts w:ascii="Courier New" w:eastAsia="Times New Roman" w:hAnsi="Courier New" w:cs="Courier New"/>
@@ -13082,6 +13356,7 @@
           <w:tab w:val="left" w:pos="13740"/>
           <w:tab w:val="left" w:pos="14656"/>
         </w:tabs>
+        <w:bidi/>
         <w:spacing w:after="0" w:line="240" w:lineRule="auto"/>
         <w:rPr>
           <w:rFonts w:ascii="Courier New" w:eastAsia="Times New Roman" w:hAnsi="Courier New" w:cs="Courier New"/>
@@ -13172,6 +13447,7 @@
           <w:tab w:val="left" w:pos="13740"/>
           <w:tab w:val="left" w:pos="14656"/>
         </w:tabs>
+        <w:bidi/>
         <w:spacing w:after="0" w:line="240" w:lineRule="auto"/>
         <w:rPr>
           <w:rFonts w:ascii="Courier New" w:eastAsia="Times New Roman" w:hAnsi="Courier New" w:cs="Courier New"/>
@@ -13246,6 +13522,7 @@
           <w:tab w:val="left" w:pos="13740"/>
           <w:tab w:val="left" w:pos="14656"/>
         </w:tabs>
+        <w:bidi/>
         <w:spacing w:after="0" w:line="240" w:lineRule="auto"/>
         <w:rPr>
           <w:rFonts w:ascii="Courier New" w:eastAsia="Times New Roman" w:hAnsi="Courier New" w:cs="Courier New"/>
@@ -13300,6 +13577,7 @@
           <w:tab w:val="left" w:pos="13740"/>
           <w:tab w:val="left" w:pos="14656"/>
         </w:tabs>
+        <w:bidi/>
         <w:spacing w:after="0" w:line="240" w:lineRule="auto"/>
         <w:rPr>
           <w:rFonts w:ascii="Courier New" w:eastAsia="Times New Roman" w:hAnsi="Courier New" w:cs="Courier New"/>
@@ -13328,6 +13606,7 @@
           <w:tab w:val="left" w:pos="13740"/>
           <w:tab w:val="left" w:pos="14656"/>
         </w:tabs>
+        <w:bidi/>
         <w:spacing w:after="0" w:line="240" w:lineRule="auto"/>
         <w:rPr>
           <w:rFonts w:ascii="Courier New" w:eastAsia="Times New Roman" w:hAnsi="Courier New" w:cs="Courier New"/>
@@ -13382,6 +13661,7 @@
           <w:tab w:val="left" w:pos="13740"/>
           <w:tab w:val="left" w:pos="14656"/>
         </w:tabs>
+        <w:bidi/>
         <w:spacing w:after="0" w:line="240" w:lineRule="auto"/>
         <w:rPr>
           <w:rFonts w:ascii="Courier New" w:eastAsia="Times New Roman" w:hAnsi="Courier New" w:cs="Courier New"/>
@@ -13418,6 +13698,7 @@
     </w:p>
     <w:p>
       <w:pPr>
+        <w:bidi/>
         <w:spacing w:before="100" w:beforeAutospacing="1" w:after="100" w:afterAutospacing="1" w:line="240" w:lineRule="auto"/>
         <w:rPr>
           <w:rFonts w:ascii="Times New Roman" w:eastAsia="Times New Roman" w:hAnsi="Times New Roman" w:cs="Times New Roman"/>
@@ -13527,6 +13808,7 @@
     </w:p>
     <w:p>
       <w:pPr>
+        <w:bidi/>
         <w:spacing w:after="0" w:line="240" w:lineRule="auto"/>
         <w:rPr>
           <w:rFonts w:ascii="Times New Roman" w:eastAsia="Times New Roman" w:hAnsi="Times New Roman" w:cs="Times New Roman"/>
@@ -13563,6 +13845,7 @@
           <w:tab w:val="left" w:pos="13740"/>
           <w:tab w:val="left" w:pos="14656"/>
         </w:tabs>
+        <w:bidi/>
         <w:spacing w:after="0" w:line="240" w:lineRule="auto"/>
         <w:rPr>
           <w:rFonts w:ascii="Courier New" w:eastAsia="Times New Roman" w:hAnsi="Courier New" w:cs="Courier New"/>
@@ -13626,6 +13909,7 @@
           <w:tab w:val="left" w:pos="13740"/>
           <w:tab w:val="left" w:pos="14656"/>
         </w:tabs>
+        <w:bidi/>
         <w:spacing w:after="0" w:line="240" w:lineRule="auto"/>
         <w:rPr>
           <w:rFonts w:ascii="Courier New" w:eastAsia="Times New Roman" w:hAnsi="Courier New" w:cs="Courier New"/>
@@ -13700,6 +13984,7 @@
           <w:tab w:val="left" w:pos="13740"/>
           <w:tab w:val="left" w:pos="14656"/>
         </w:tabs>
+        <w:bidi/>
         <w:spacing w:after="0" w:line="240" w:lineRule="auto"/>
         <w:rPr>
           <w:rFonts w:ascii="Courier New" w:eastAsia="Times New Roman" w:hAnsi="Courier New" w:cs="Courier New"/>
@@ -13826,6 +14111,7 @@
           <w:tab w:val="left" w:pos="13740"/>
           <w:tab w:val="left" w:pos="14656"/>
         </w:tabs>
+        <w:bidi/>
         <w:spacing w:after="0" w:line="240" w:lineRule="auto"/>
         <w:rPr>
           <w:rFonts w:ascii="Courier New" w:eastAsia="Times New Roman" w:hAnsi="Courier New" w:cs="Courier New"/>
@@ -13879,6 +14165,7 @@
           <w:tab w:val="left" w:pos="13740"/>
           <w:tab w:val="left" w:pos="14656"/>
         </w:tabs>
+        <w:bidi/>
         <w:spacing w:after="0" w:line="240" w:lineRule="auto"/>
         <w:rPr>
           <w:rFonts w:ascii="Courier New" w:eastAsia="Times New Roman" w:hAnsi="Courier New" w:cs="Courier New"/>
@@ -13932,6 +14219,7 @@
           <w:tab w:val="left" w:pos="13740"/>
           <w:tab w:val="left" w:pos="14656"/>
         </w:tabs>
+        <w:bidi/>
         <w:spacing w:after="0" w:line="240" w:lineRule="auto"/>
         <w:rPr>
           <w:rFonts w:ascii="Courier New" w:eastAsia="Times New Roman" w:hAnsi="Courier New" w:cs="Courier New"/>
@@ -14040,6 +14328,7 @@
           <w:tab w:val="left" w:pos="13740"/>
           <w:tab w:val="left" w:pos="14656"/>
         </w:tabs>
+        <w:bidi/>
         <w:spacing w:after="0" w:line="240" w:lineRule="auto"/>
         <w:rPr>
           <w:rFonts w:ascii="Courier New" w:eastAsia="Times New Roman" w:hAnsi="Courier New" w:cs="Courier New"/>
@@ -14114,6 +14403,7 @@
           <w:tab w:val="left" w:pos="13740"/>
           <w:tab w:val="left" w:pos="14656"/>
         </w:tabs>
+        <w:bidi/>
         <w:spacing w:after="0" w:line="240" w:lineRule="auto"/>
         <w:rPr>
           <w:rFonts w:ascii="Courier New" w:eastAsia="Times New Roman" w:hAnsi="Courier New" w:cs="Courier New"/>
@@ -14168,6 +14458,7 @@
           <w:tab w:val="left" w:pos="13740"/>
           <w:tab w:val="left" w:pos="14656"/>
         </w:tabs>
+        <w:bidi/>
         <w:spacing w:after="0" w:line="240" w:lineRule="auto"/>
         <w:rPr>
           <w:rFonts w:ascii="Courier New" w:eastAsia="Times New Roman" w:hAnsi="Courier New" w:cs="Courier New"/>
@@ -14196,6 +14487,7 @@
           <w:tab w:val="left" w:pos="13740"/>
           <w:tab w:val="left" w:pos="14656"/>
         </w:tabs>
+        <w:bidi/>
         <w:spacing w:after="0" w:line="240" w:lineRule="auto"/>
         <w:rPr>
           <w:rFonts w:ascii="Courier New" w:eastAsia="Times New Roman" w:hAnsi="Courier New" w:cs="Courier New"/>
@@ -14251,6 +14543,7 @@
           <w:tab w:val="left" w:pos="13740"/>
           <w:tab w:val="left" w:pos="14656"/>
         </w:tabs>
+        <w:bidi/>
         <w:spacing w:after="0" w:line="240" w:lineRule="auto"/>
         <w:rPr>
           <w:rFonts w:ascii="Courier New" w:eastAsia="Times New Roman" w:hAnsi="Courier New" w:cs="Courier New"/>
@@ -14315,6 +14608,7 @@
     </w:p>
     <w:p>
       <w:pPr>
+        <w:bidi/>
         <w:spacing w:before="100" w:beforeAutospacing="1" w:after="100" w:afterAutospacing="1" w:line="240" w:lineRule="auto"/>
         <w:outlineLvl w:val="2"/>
         <w:rPr>
@@ -14382,6 +14676,7 @@
     </w:p>
     <w:p>
       <w:pPr>
+        <w:bidi/>
         <w:spacing w:before="100" w:beforeAutospacing="1" w:after="100" w:afterAutospacing="1" w:line="240" w:lineRule="auto"/>
         <w:rPr>
           <w:rFonts w:ascii="Times New Roman" w:eastAsia="Times New Roman" w:hAnsi="Times New Roman" w:cs="Times New Roman"/>
@@ -14409,6 +14704,7 @@
     </w:p>
     <w:p>
       <w:pPr>
+        <w:bidi/>
         <w:spacing w:after="0" w:line="240" w:lineRule="auto"/>
         <w:rPr>
           <w:rFonts w:ascii="Times New Roman" w:eastAsia="Times New Roman" w:hAnsi="Times New Roman" w:cs="Times New Roman"/>
@@ -14445,6 +14741,7 @@
           <w:tab w:val="left" w:pos="13740"/>
           <w:tab w:val="left" w:pos="14656"/>
         </w:tabs>
+        <w:bidi/>
         <w:spacing w:after="0" w:line="240" w:lineRule="auto"/>
         <w:rPr>
           <w:rFonts w:ascii="Courier New" w:eastAsia="Times New Roman" w:hAnsi="Courier New" w:cs="Courier New"/>
@@ -14519,6 +14816,7 @@
           <w:tab w:val="left" w:pos="13740"/>
           <w:tab w:val="left" w:pos="14656"/>
         </w:tabs>
+        <w:bidi/>
         <w:spacing w:after="0" w:line="240" w:lineRule="auto"/>
         <w:rPr>
           <w:rFonts w:ascii="Courier New" w:eastAsia="Times New Roman" w:hAnsi="Courier New" w:cs="Courier New"/>
@@ -14547,6 +14845,7 @@
           <w:tab w:val="left" w:pos="13740"/>
           <w:tab w:val="left" w:pos="14656"/>
         </w:tabs>
+        <w:bidi/>
         <w:spacing w:after="0" w:line="240" w:lineRule="auto"/>
         <w:rPr>
           <w:rFonts w:ascii="Courier New" w:eastAsia="Times New Roman" w:hAnsi="Courier New" w:cs="Courier New"/>
@@ -14592,6 +14891,7 @@
           <w:tab w:val="left" w:pos="13740"/>
           <w:tab w:val="left" w:pos="14656"/>
         </w:tabs>
+        <w:bidi/>
         <w:spacing w:after="0" w:line="240" w:lineRule="auto"/>
         <w:rPr>
           <w:rFonts w:ascii="Courier New" w:eastAsia="Times New Roman" w:hAnsi="Courier New" w:cs="Courier New"/>
@@ -14656,6 +14956,7 @@
           <w:tab w:val="left" w:pos="13740"/>
           <w:tab w:val="left" w:pos="14656"/>
         </w:tabs>
+        <w:bidi/>
         <w:spacing w:after="0" w:line="240" w:lineRule="auto"/>
         <w:rPr>
           <w:rFonts w:ascii="Courier New" w:eastAsia="Times New Roman" w:hAnsi="Courier New" w:cs="Courier New"/>
@@ -14684,6 +14985,7 @@
           <w:tab w:val="left" w:pos="13740"/>
           <w:tab w:val="left" w:pos="14656"/>
         </w:tabs>
+        <w:bidi/>
         <w:spacing w:after="0" w:line="240" w:lineRule="auto"/>
         <w:rPr>
           <w:rFonts w:ascii="Courier New" w:eastAsia="Times New Roman" w:hAnsi="Courier New" w:cs="Courier New"/>
@@ -14755,6 +15057,7 @@
           <w:tab w:val="left" w:pos="13740"/>
           <w:tab w:val="left" w:pos="14656"/>
         </w:tabs>
+        <w:bidi/>
         <w:spacing w:after="0" w:line="240" w:lineRule="auto"/>
         <w:rPr>
           <w:rFonts w:ascii="Courier New" w:eastAsia="Times New Roman" w:hAnsi="Courier New" w:cs="Courier New"/>
@@ -14819,6 +15122,7 @@
           <w:tab w:val="left" w:pos="13740"/>
           <w:tab w:val="left" w:pos="14656"/>
         </w:tabs>
+        <w:bidi/>
         <w:spacing w:after="0" w:line="240" w:lineRule="auto"/>
         <w:rPr>
           <w:rFonts w:ascii="Courier New" w:eastAsia="Times New Roman" w:hAnsi="Courier New" w:cs="Courier New"/>
@@ -14847,6 +15151,7 @@
           <w:tab w:val="left" w:pos="13740"/>
           <w:tab w:val="left" w:pos="14656"/>
         </w:tabs>
+        <w:bidi/>
         <w:spacing w:after="0" w:line="240" w:lineRule="auto"/>
         <w:rPr>
           <w:rFonts w:ascii="Courier New" w:eastAsia="Times New Roman" w:hAnsi="Courier New" w:cs="Courier New"/>
@@ -14900,6 +15205,7 @@
           <w:tab w:val="left" w:pos="13740"/>
           <w:tab w:val="left" w:pos="14656"/>
         </w:tabs>
+        <w:bidi/>
         <w:spacing w:after="0" w:line="240" w:lineRule="auto"/>
         <w:rPr>
           <w:rFonts w:ascii="Courier New" w:eastAsia="Times New Roman" w:hAnsi="Courier New" w:cs="Courier New"/>
@@ -14954,6 +15260,7 @@
     </w:p>
     <w:p>
       <w:pPr>
+        <w:bidi/>
         <w:spacing w:before="100" w:beforeAutospacing="1" w:after="100" w:afterAutospacing="1" w:line="240" w:lineRule="auto"/>
         <w:rPr>
           <w:rFonts w:ascii="Times New Roman" w:eastAsia="Times New Roman" w:hAnsi="Times New Roman" w:cs="Times New Roman"/>
@@ -15003,6 +15310,7 @@
           <w:tab w:val="left" w:pos="13740"/>
           <w:tab w:val="left" w:pos="14656"/>
         </w:tabs>
+        <w:bidi/>
         <w:spacing w:after="0" w:line="240" w:lineRule="auto"/>
         <w:rPr>
           <w:rFonts w:ascii="Courier New" w:eastAsia="Times New Roman" w:hAnsi="Courier New" w:cs="Courier New"/>
@@ -15039,6 +15347,7 @@
           <w:tab w:val="left" w:pos="13740"/>
           <w:tab w:val="left" w:pos="14656"/>
         </w:tabs>
+        <w:bidi/>
         <w:spacing w:after="0" w:line="240" w:lineRule="auto"/>
         <w:rPr>
           <w:rFonts w:ascii="Courier New" w:eastAsia="Times New Roman" w:hAnsi="Courier New" w:cs="Courier New"/>
@@ -15075,6 +15384,7 @@
           <w:tab w:val="left" w:pos="13740"/>
           <w:tab w:val="left" w:pos="14656"/>
         </w:tabs>
+        <w:bidi/>
         <w:spacing w:after="0" w:line="240" w:lineRule="auto"/>
         <w:rPr>
           <w:rFonts w:ascii="Courier New" w:eastAsia="Times New Roman" w:hAnsi="Courier New" w:cs="Courier New"/>
@@ -15111,6 +15421,7 @@
           <w:tab w:val="left" w:pos="13740"/>
           <w:tab w:val="left" w:pos="14656"/>
         </w:tabs>
+        <w:bidi/>
         <w:spacing w:after="0" w:line="240" w:lineRule="auto"/>
         <w:rPr>
           <w:rFonts w:ascii="Courier New" w:eastAsia="Times New Roman" w:hAnsi="Courier New" w:cs="Courier New"/>
@@ -15147,6 +15458,7 @@
           <w:tab w:val="left" w:pos="13740"/>
           <w:tab w:val="left" w:pos="14656"/>
         </w:tabs>
+        <w:bidi/>
         <w:spacing w:after="0" w:line="240" w:lineRule="auto"/>
         <w:rPr>
           <w:rFonts w:ascii="Courier New" w:eastAsia="Times New Roman" w:hAnsi="Courier New" w:cs="Courier New"/>
@@ -15183,6 +15495,7 @@
           <w:tab w:val="left" w:pos="13740"/>
           <w:tab w:val="left" w:pos="14656"/>
         </w:tabs>
+        <w:bidi/>
         <w:spacing w:after="0" w:line="240" w:lineRule="auto"/>
         <w:rPr>
           <w:rFonts w:ascii="Courier New" w:eastAsia="Times New Roman" w:hAnsi="Courier New" w:cs="Courier New"/>
@@ -15201,6 +15514,7 @@
     </w:p>
     <w:p>
       <w:pPr>
+        <w:bidi/>
         <w:spacing w:before="100" w:beforeAutospacing="1" w:after="100" w:afterAutospacing="1" w:line="240" w:lineRule="auto"/>
         <w:rPr>
           <w:rFonts w:ascii="Times New Roman" w:eastAsia="Times New Roman" w:hAnsi="Times New Roman" w:cs="Times New Roman"/>
@@ -15339,11 +15653,13 @@
     </w:p>
     <w:p>
       <w:pPr>
+        <w:bidi/>
         <w:spacing w:before="100" w:beforeAutospacing="1" w:after="100" w:afterAutospacing="1" w:line="240" w:lineRule="auto"/>
       </w:pPr>
     </w:p>
     <w:p>
       <w:pPr>
+        <w:bidi/>
         <w:rPr>
           <w:rFonts w:ascii="Times New Roman" w:eastAsia="Times New Roman" w:hAnsi="Times New Roman" w:cs="Times New Roman"/>
           <w:sz w:val="24"/>
@@ -15360,6 +15676,7 @@
     </w:p>
     <w:p>
       <w:pPr>
+        <w:bidi/>
         <w:spacing w:before="100" w:beforeAutospacing="1" w:after="100" w:afterAutospacing="1" w:line="240" w:lineRule="auto"/>
         <w:outlineLvl w:val="1"/>
         <w:rPr>
@@ -15491,6 +15808,7 @@
     </w:p>
     <w:p>
       <w:pPr>
+        <w:bidi/>
         <w:spacing w:before="100" w:beforeAutospacing="1" w:after="100" w:afterAutospacing="1" w:line="240" w:lineRule="auto"/>
         <w:outlineLvl w:val="2"/>
         <w:rPr>
@@ -15535,6 +15853,7 @@
     </w:p>
     <w:p>
       <w:pPr>
+        <w:bidi/>
         <w:spacing w:before="100" w:beforeAutospacing="1" w:after="100" w:afterAutospacing="1" w:line="240" w:lineRule="auto"/>
         <w:rPr>
           <w:rFonts w:ascii="Times New Roman" w:eastAsia="Times New Roman" w:hAnsi="Times New Roman" w:cs="Times New Roman"/>
@@ -15595,6 +15914,7 @@
           <w:ilvl w:val="0"/>
           <w:numId w:val="22"/>
         </w:numPr>
+        <w:bidi/>
         <w:spacing w:before="100" w:beforeAutospacing="1" w:after="100" w:afterAutospacing="1" w:line="240" w:lineRule="auto"/>
         <w:rPr>
           <w:rFonts w:ascii="Times New Roman" w:eastAsia="Times New Roman" w:hAnsi="Times New Roman" w:cs="Times New Roman"/>
@@ -15756,6 +16076,7 @@
           <w:ilvl w:val="0"/>
           <w:numId w:val="22"/>
         </w:numPr>
+        <w:bidi/>
         <w:spacing w:before="100" w:beforeAutospacing="1" w:after="100" w:afterAutospacing="1" w:line="240" w:lineRule="auto"/>
         <w:rPr>
           <w:rFonts w:ascii="Times New Roman" w:eastAsia="Times New Roman" w:hAnsi="Times New Roman" w:cs="Times New Roman"/>
@@ -15908,6 +16229,7 @@
           <w:ilvl w:val="0"/>
           <w:numId w:val="22"/>
         </w:numPr>
+        <w:bidi/>
         <w:spacing w:before="100" w:beforeAutospacing="1" w:after="100" w:afterAutospacing="1" w:line="240" w:lineRule="auto"/>
         <w:rPr>
           <w:rFonts w:ascii="Times New Roman" w:eastAsia="Times New Roman" w:hAnsi="Times New Roman" w:cs="Times New Roman"/>
@@ -16062,6 +16384,7 @@
           <w:ilvl w:val="0"/>
           <w:numId w:val="22"/>
         </w:numPr>
+        <w:bidi/>
         <w:spacing w:before="100" w:beforeAutospacing="1" w:after="100" w:afterAutospacing="1" w:line="240" w:lineRule="auto"/>
         <w:rPr>
           <w:rFonts w:ascii="Times New Roman" w:eastAsia="Times New Roman" w:hAnsi="Times New Roman" w:cs="Times New Roman"/>
@@ -16155,6 +16478,7 @@
           <w:ilvl w:val="0"/>
           <w:numId w:val="22"/>
         </w:numPr>
+        <w:bidi/>
         <w:spacing w:before="100" w:beforeAutospacing="1" w:after="100" w:afterAutospacing="1" w:line="240" w:lineRule="auto"/>
         <w:rPr>
           <w:rFonts w:ascii="Times New Roman" w:eastAsia="Times New Roman" w:hAnsi="Times New Roman" w:cs="Times New Roman"/>
@@ -16307,6 +16631,7 @@
           <w:ilvl w:val="0"/>
           <w:numId w:val="22"/>
         </w:numPr>
+        <w:bidi/>
         <w:spacing w:before="100" w:beforeAutospacing="1" w:after="100" w:afterAutospacing="1" w:line="240" w:lineRule="auto"/>
         <w:rPr>
           <w:rFonts w:ascii="Times New Roman" w:eastAsia="Times New Roman" w:hAnsi="Times New Roman" w:cs="Times New Roman"/>
@@ -16425,6 +16750,7 @@
           <w:ilvl w:val="0"/>
           <w:numId w:val="22"/>
         </w:numPr>
+        <w:bidi/>
         <w:spacing w:before="100" w:beforeAutospacing="1" w:after="100" w:afterAutospacing="1" w:line="240" w:lineRule="auto"/>
         <w:rPr>
           <w:rFonts w:ascii="Times New Roman" w:eastAsia="Times New Roman" w:hAnsi="Times New Roman" w:cs="Times New Roman"/>
@@ -16581,6 +16907,7 @@
           <w:ilvl w:val="0"/>
           <w:numId w:val="22"/>
         </w:numPr>
+        <w:bidi/>
         <w:spacing w:before="100" w:beforeAutospacing="1" w:after="100" w:afterAutospacing="1" w:line="240" w:lineRule="auto"/>
         <w:rPr>
           <w:rFonts w:ascii="Times New Roman" w:eastAsia="Times New Roman" w:hAnsi="Times New Roman" w:cs="Times New Roman"/>
@@ -16716,6 +17043,7 @@
           <w:ilvl w:val="0"/>
           <w:numId w:val="22"/>
         </w:numPr>
+        <w:bidi/>
         <w:spacing w:before="100" w:beforeAutospacing="1" w:after="100" w:afterAutospacing="1" w:line="240" w:lineRule="auto"/>
         <w:rPr>
           <w:rFonts w:ascii="Times New Roman" w:eastAsia="Times New Roman" w:hAnsi="Times New Roman" w:cs="Times New Roman"/>
@@ -16861,6 +17189,7 @@
           <w:ilvl w:val="0"/>
           <w:numId w:val="22"/>
         </w:numPr>
+        <w:bidi/>
         <w:spacing w:before="100" w:beforeAutospacing="1" w:after="100" w:afterAutospacing="1" w:line="240" w:lineRule="auto"/>
         <w:rPr>
           <w:rFonts w:ascii="Times New Roman" w:eastAsia="Times New Roman" w:hAnsi="Times New Roman" w:cs="Times New Roman"/>
@@ -17077,6 +17406,7 @@
     </w:p>
     <w:p>
       <w:pPr>
+        <w:bidi/>
         <w:spacing w:after="0" w:line="240" w:lineRule="auto"/>
         <w:rPr>
           <w:rFonts w:ascii="Times New Roman" w:eastAsia="Times New Roman" w:hAnsi="Times New Roman" w:cs="Times New Roman"/>
@@ -17091,12 +17421,13 @@
           <w:szCs w:val="24"/>
         </w:rPr>
         <w:pict w14:anchorId="23318FD4">
-          <v:rect id="_x0000_i1062" style="width:0;height:1.5pt" o:hralign="center" o:hrstd="t" o:hr="t" fillcolor="#a0a0a0" stroked="f"/>
+          <v:rect id="_x0000_i1039" style="width:0;height:1.5pt" o:hralign="right" o:hrstd="t" o:hr="t" fillcolor="#a0a0a0" stroked="f"/>
         </w:pict>
       </w:r>
     </w:p>
     <w:p>
       <w:pPr>
+        <w:bidi/>
         <w:spacing w:before="100" w:beforeAutospacing="1" w:after="100" w:afterAutospacing="1" w:line="240" w:lineRule="auto"/>
         <w:outlineLvl w:val="2"/>
         <w:rPr>
@@ -17141,6 +17472,7 @@
     </w:p>
     <w:p>
       <w:pPr>
+        <w:bidi/>
         <w:spacing w:before="100" w:beforeAutospacing="1" w:after="100" w:afterAutospacing="1" w:line="240" w:lineRule="auto"/>
         <w:rPr>
           <w:rFonts w:ascii="Times New Roman" w:eastAsia="Times New Roman" w:hAnsi="Times New Roman" w:cs="Times New Roman"/>
@@ -17201,6 +17533,7 @@
           <w:ilvl w:val="0"/>
           <w:numId w:val="23"/>
         </w:numPr>
+        <w:bidi/>
         <w:spacing w:before="100" w:beforeAutospacing="1" w:after="100" w:afterAutospacing="1" w:line="240" w:lineRule="auto"/>
         <w:rPr>
           <w:rFonts w:ascii="Times New Roman" w:eastAsia="Times New Roman" w:hAnsi="Times New Roman" w:cs="Times New Roman"/>
@@ -17369,6 +17702,7 @@
           <w:ilvl w:val="0"/>
           <w:numId w:val="23"/>
         </w:numPr>
+        <w:bidi/>
         <w:spacing w:before="100" w:beforeAutospacing="1" w:after="100" w:afterAutospacing="1" w:line="240" w:lineRule="auto"/>
         <w:rPr>
           <w:rFonts w:ascii="Times New Roman" w:eastAsia="Times New Roman" w:hAnsi="Times New Roman" w:cs="Times New Roman"/>
@@ -17563,6 +17897,7 @@
           <w:ilvl w:val="0"/>
           <w:numId w:val="23"/>
         </w:numPr>
+        <w:bidi/>
         <w:spacing w:before="100" w:beforeAutospacing="1" w:after="100" w:afterAutospacing="1" w:line="240" w:lineRule="auto"/>
         <w:rPr>
           <w:rFonts w:ascii="Times New Roman" w:eastAsia="Times New Roman" w:hAnsi="Times New Roman" w:cs="Times New Roman"/>
@@ -17725,6 +18060,7 @@
           <w:ilvl w:val="0"/>
           <w:numId w:val="23"/>
         </w:numPr>
+        <w:bidi/>
         <w:spacing w:before="100" w:beforeAutospacing="1" w:after="100" w:afterAutospacing="1" w:line="240" w:lineRule="auto"/>
         <w:rPr>
           <w:rFonts w:ascii="Times New Roman" w:eastAsia="Times New Roman" w:hAnsi="Times New Roman" w:cs="Times New Roman"/>
@@ -17854,6 +18190,7 @@
           <w:ilvl w:val="0"/>
           <w:numId w:val="23"/>
         </w:numPr>
+        <w:bidi/>
         <w:spacing w:before="100" w:beforeAutospacing="1" w:after="100" w:afterAutospacing="1" w:line="240" w:lineRule="auto"/>
         <w:rPr>
           <w:rFonts w:ascii="Times New Roman" w:eastAsia="Times New Roman" w:hAnsi="Times New Roman" w:cs="Times New Roman"/>
@@ -18016,6 +18353,7 @@
           <w:ilvl w:val="0"/>
           <w:numId w:val="23"/>
         </w:numPr>
+        <w:bidi/>
         <w:spacing w:before="100" w:beforeAutospacing="1" w:after="100" w:afterAutospacing="1" w:line="240" w:lineRule="auto"/>
         <w:rPr>
           <w:rFonts w:ascii="Times New Roman" w:eastAsia="Times New Roman" w:hAnsi="Times New Roman" w:cs="Times New Roman"/>
@@ -18151,6 +18489,7 @@
           <w:ilvl w:val="0"/>
           <w:numId w:val="23"/>
         </w:numPr>
+        <w:bidi/>
         <w:spacing w:before="100" w:beforeAutospacing="1" w:after="100" w:afterAutospacing="1" w:line="240" w:lineRule="auto"/>
         <w:rPr>
           <w:rFonts w:ascii="Times New Roman" w:eastAsia="Times New Roman" w:hAnsi="Times New Roman" w:cs="Times New Roman"/>
@@ -18345,6 +18684,7 @@
           <w:ilvl w:val="0"/>
           <w:numId w:val="23"/>
         </w:numPr>
+        <w:bidi/>
         <w:spacing w:before="100" w:beforeAutospacing="1" w:after="100" w:afterAutospacing="1" w:line="240" w:lineRule="auto"/>
         <w:rPr>
           <w:rFonts w:ascii="Times New Roman" w:eastAsia="Times New Roman" w:hAnsi="Times New Roman" w:cs="Times New Roman"/>
@@ -18551,6 +18891,7 @@
           <w:ilvl w:val="0"/>
           <w:numId w:val="23"/>
         </w:numPr>
+        <w:bidi/>
         <w:spacing w:before="100" w:beforeAutospacing="1" w:after="100" w:afterAutospacing="1" w:line="240" w:lineRule="auto"/>
         <w:rPr>
           <w:rFonts w:ascii="Times New Roman" w:eastAsia="Times New Roman" w:hAnsi="Times New Roman" w:cs="Times New Roman"/>
@@ -18730,6 +19071,7 @@
           <w:ilvl w:val="0"/>
           <w:numId w:val="23"/>
         </w:numPr>
+        <w:bidi/>
         <w:spacing w:before="100" w:beforeAutospacing="1" w:after="100" w:afterAutospacing="1" w:line="240" w:lineRule="auto"/>
         <w:rPr>
           <w:rFonts w:ascii="Times New Roman" w:eastAsia="Times New Roman" w:hAnsi="Times New Roman" w:cs="Times New Roman"/>
@@ -18863,6 +19205,7 @@
     </w:p>
     <w:p>
       <w:pPr>
+        <w:bidi/>
         <w:spacing w:after="0" w:line="240" w:lineRule="auto"/>
         <w:rPr>
           <w:rFonts w:ascii="Times New Roman" w:eastAsia="Times New Roman" w:hAnsi="Times New Roman" w:cs="Times New Roman"/>
@@ -18877,12 +19220,13 @@
           <w:szCs w:val="24"/>
         </w:rPr>
         <w:pict w14:anchorId="3F67759B">
-          <v:rect id="_x0000_i1063" style="width:0;height:1.5pt" o:hralign="center" o:hrstd="t" o:hr="t" fillcolor="#a0a0a0" stroked="f"/>
+          <v:rect id="_x0000_i1040" style="width:0;height:1.5pt" o:hralign="right" o:hrstd="t" o:hr="t" fillcolor="#a0a0a0" stroked="f"/>
         </w:pict>
       </w:r>
     </w:p>
     <w:p>
       <w:pPr>
+        <w:bidi/>
         <w:spacing w:before="100" w:beforeAutospacing="1" w:after="100" w:afterAutospacing="1" w:line="240" w:lineRule="auto"/>
         <w:outlineLvl w:val="2"/>
         <w:rPr>
@@ -18927,6 +19271,7 @@
     </w:p>
     <w:p>
       <w:pPr>
+        <w:bidi/>
         <w:spacing w:before="100" w:beforeAutospacing="1" w:after="100" w:afterAutospacing="1" w:line="240" w:lineRule="auto"/>
         <w:rPr>
           <w:rFonts w:ascii="Times New Roman" w:eastAsia="Times New Roman" w:hAnsi="Times New Roman" w:cs="Times New Roman"/>
@@ -18987,6 +19332,7 @@
           <w:ilvl w:val="0"/>
           <w:numId w:val="24"/>
         </w:numPr>
+        <w:bidi/>
         <w:spacing w:before="100" w:beforeAutospacing="1" w:after="100" w:afterAutospacing="1" w:line="240" w:lineRule="auto"/>
         <w:rPr>
           <w:rFonts w:ascii="Times New Roman" w:eastAsia="Times New Roman" w:hAnsi="Times New Roman" w:cs="Times New Roman"/>
@@ -19133,6 +19479,7 @@
           <w:ilvl w:val="0"/>
           <w:numId w:val="24"/>
         </w:numPr>
+        <w:bidi/>
         <w:spacing w:before="100" w:beforeAutospacing="1" w:after="100" w:afterAutospacing="1" w:line="240" w:lineRule="auto"/>
         <w:rPr>
           <w:rFonts w:ascii="Times New Roman" w:eastAsia="Times New Roman" w:hAnsi="Times New Roman" w:cs="Times New Roman"/>
@@ -19250,6 +19597,7 @@
           <w:ilvl w:val="0"/>
           <w:numId w:val="24"/>
         </w:numPr>
+        <w:bidi/>
         <w:spacing w:before="100" w:beforeAutospacing="1" w:after="100" w:afterAutospacing="1" w:line="240" w:lineRule="auto"/>
         <w:rPr>
           <w:rFonts w:ascii="Times New Roman" w:eastAsia="Times New Roman" w:hAnsi="Times New Roman" w:cs="Times New Roman"/>
@@ -19435,6 +19783,7 @@
           <w:ilvl w:val="0"/>
           <w:numId w:val="24"/>
         </w:numPr>
+        <w:bidi/>
         <w:spacing w:before="100" w:beforeAutospacing="1" w:after="100" w:afterAutospacing="1" w:line="240" w:lineRule="auto"/>
         <w:rPr>
           <w:rFonts w:ascii="Times New Roman" w:eastAsia="Times New Roman" w:hAnsi="Times New Roman" w:cs="Times New Roman"/>
@@ -19591,6 +19940,7 @@
           <w:ilvl w:val="0"/>
           <w:numId w:val="24"/>
         </w:numPr>
+        <w:bidi/>
         <w:spacing w:before="100" w:beforeAutospacing="1" w:after="100" w:afterAutospacing="1" w:line="240" w:lineRule="auto"/>
         <w:rPr>
           <w:rFonts w:ascii="Times New Roman" w:eastAsia="Times New Roman" w:hAnsi="Times New Roman" w:cs="Times New Roman"/>
@@ -19775,6 +20125,7 @@
           <w:ilvl w:val="0"/>
           <w:numId w:val="24"/>
         </w:numPr>
+        <w:bidi/>
         <w:spacing w:before="100" w:beforeAutospacing="1" w:after="100" w:afterAutospacing="1" w:line="240" w:lineRule="auto"/>
         <w:rPr>
           <w:rFonts w:ascii="Times New Roman" w:eastAsia="Times New Roman" w:hAnsi="Times New Roman" w:cs="Times New Roman"/>
@@ -20008,6 +20359,7 @@
           <w:ilvl w:val="0"/>
           <w:numId w:val="24"/>
         </w:numPr>
+        <w:bidi/>
         <w:spacing w:before="100" w:beforeAutospacing="1" w:after="100" w:afterAutospacing="1" w:line="240" w:lineRule="auto"/>
         <w:rPr>
           <w:rFonts w:ascii="Times New Roman" w:eastAsia="Times New Roman" w:hAnsi="Times New Roman" w:cs="Times New Roman"/>
@@ -20251,6 +20603,7 @@
           <w:ilvl w:val="0"/>
           <w:numId w:val="24"/>
         </w:numPr>
+        <w:bidi/>
         <w:spacing w:before="100" w:beforeAutospacing="1" w:after="100" w:afterAutospacing="1" w:line="240" w:lineRule="auto"/>
         <w:rPr>
           <w:rFonts w:ascii="Times New Roman" w:eastAsia="Times New Roman" w:hAnsi="Times New Roman" w:cs="Times New Roman"/>
@@ -20495,6 +20848,7 @@
           <w:ilvl w:val="0"/>
           <w:numId w:val="24"/>
         </w:numPr>
+        <w:bidi/>
         <w:spacing w:before="100" w:beforeAutospacing="1" w:after="100" w:afterAutospacing="1" w:line="240" w:lineRule="auto"/>
         <w:rPr>
           <w:rFonts w:ascii="Times New Roman" w:eastAsia="Times New Roman" w:hAnsi="Times New Roman" w:cs="Times New Roman"/>
@@ -20640,6 +20994,7 @@
           <w:ilvl w:val="0"/>
           <w:numId w:val="24"/>
         </w:numPr>
+        <w:bidi/>
         <w:spacing w:before="100" w:beforeAutospacing="1" w:after="100" w:afterAutospacing="1" w:line="240" w:lineRule="auto"/>
         <w:rPr>
           <w:rFonts w:ascii="Times New Roman" w:eastAsia="Times New Roman" w:hAnsi="Times New Roman" w:cs="Times New Roman"/>
@@ -20800,6 +21155,7 @@
     </w:p>
     <w:p>
       <w:pPr>
+        <w:bidi/>
         <w:spacing w:after="0" w:line="240" w:lineRule="auto"/>
         <w:rPr>
           <w:rFonts w:ascii="Times New Roman" w:eastAsia="Times New Roman" w:hAnsi="Times New Roman" w:cs="Times New Roman"/>
@@ -20814,12 +21170,13 @@
           <w:szCs w:val="24"/>
         </w:rPr>
         <w:pict w14:anchorId="7F17A0FC">
-          <v:rect id="_x0000_i1064" style="width:0;height:1.5pt" o:hralign="center" o:hrstd="t" o:hr="t" fillcolor="#a0a0a0" stroked="f"/>
+          <v:rect id="_x0000_i1041" style="width:0;height:1.5pt" o:hralign="right" o:hrstd="t" o:hr="t" fillcolor="#a0a0a0" stroked="f"/>
         </w:pict>
       </w:r>
     </w:p>
     <w:p>
       <w:pPr>
+        <w:bidi/>
         <w:spacing w:before="100" w:beforeAutospacing="1" w:after="100" w:afterAutospacing="1" w:line="240" w:lineRule="auto"/>
         <w:outlineLvl w:val="2"/>
         <w:rPr>
@@ -20864,6 +21221,7 @@
     </w:p>
     <w:p>
       <w:pPr>
+        <w:bidi/>
         <w:spacing w:before="100" w:beforeAutospacing="1" w:after="100" w:afterAutospacing="1" w:line="240" w:lineRule="auto"/>
         <w:rPr>
           <w:rFonts w:ascii="Times New Roman" w:eastAsia="Times New Roman" w:hAnsi="Times New Roman" w:cs="Times New Roman"/>
@@ -20924,6 +21282,7 @@
           <w:ilvl w:val="0"/>
           <w:numId w:val="25"/>
         </w:numPr>
+        <w:bidi/>
         <w:spacing w:before="100" w:beforeAutospacing="1" w:after="100" w:afterAutospacing="1" w:line="240" w:lineRule="auto"/>
         <w:rPr>
           <w:rFonts w:ascii="Times New Roman" w:eastAsia="Times New Roman" w:hAnsi="Times New Roman" w:cs="Times New Roman"/>
@@ -21069,6 +21428,7 @@
           <w:ilvl w:val="0"/>
           <w:numId w:val="25"/>
         </w:numPr>
+        <w:bidi/>
         <w:spacing w:before="100" w:beforeAutospacing="1" w:after="100" w:afterAutospacing="1" w:line="240" w:lineRule="auto"/>
         <w:rPr>
           <w:rFonts w:ascii="Times New Roman" w:eastAsia="Times New Roman" w:hAnsi="Times New Roman" w:cs="Times New Roman"/>
@@ -21217,6 +21577,7 @@
           <w:ilvl w:val="0"/>
           <w:numId w:val="25"/>
         </w:numPr>
+        <w:bidi/>
         <w:spacing w:before="100" w:beforeAutospacing="1" w:after="100" w:afterAutospacing="1" w:line="240" w:lineRule="auto"/>
         <w:rPr>
           <w:rFonts w:ascii="Times New Roman" w:eastAsia="Times New Roman" w:hAnsi="Times New Roman" w:cs="Times New Roman"/>
@@ -21370,6 +21731,7 @@
           <w:ilvl w:val="0"/>
           <w:numId w:val="25"/>
         </w:numPr>
+        <w:bidi/>
         <w:spacing w:before="100" w:beforeAutospacing="1" w:after="100" w:afterAutospacing="1" w:line="240" w:lineRule="auto"/>
         <w:rPr>
           <w:rFonts w:ascii="Times New Roman" w:eastAsia="Times New Roman" w:hAnsi="Times New Roman" w:cs="Times New Roman"/>
@@ -21575,6 +21937,7 @@
           <w:ilvl w:val="0"/>
           <w:numId w:val="25"/>
         </w:numPr>
+        <w:bidi/>
         <w:spacing w:before="100" w:beforeAutospacing="1" w:after="100" w:afterAutospacing="1" w:line="240" w:lineRule="auto"/>
         <w:rPr>
           <w:rFonts w:ascii="Times New Roman" w:eastAsia="Times New Roman" w:hAnsi="Times New Roman" w:cs="Times New Roman"/>
@@ -21728,6 +22091,7 @@
           <w:ilvl w:val="0"/>
           <w:numId w:val="25"/>
         </w:numPr>
+        <w:bidi/>
         <w:spacing w:before="100" w:beforeAutospacing="1" w:after="100" w:afterAutospacing="1" w:line="240" w:lineRule="auto"/>
         <w:rPr>
           <w:rFonts w:ascii="Times New Roman" w:eastAsia="Times New Roman" w:hAnsi="Times New Roman" w:cs="Times New Roman"/>
@@ -21888,6 +22252,7 @@
           <w:ilvl w:val="0"/>
           <w:numId w:val="25"/>
         </w:numPr>
+        <w:bidi/>
         <w:spacing w:before="100" w:beforeAutospacing="1" w:after="100" w:afterAutospacing="1" w:line="240" w:lineRule="auto"/>
         <w:rPr>
           <w:rFonts w:ascii="Times New Roman" w:eastAsia="Times New Roman" w:hAnsi="Times New Roman" w:cs="Times New Roman"/>
@@ -22014,6 +22379,7 @@
           <w:ilvl w:val="0"/>
           <w:numId w:val="25"/>
         </w:numPr>
+        <w:bidi/>
         <w:spacing w:before="100" w:beforeAutospacing="1" w:after="100" w:afterAutospacing="1" w:line="240" w:lineRule="auto"/>
         <w:rPr>
           <w:rFonts w:ascii="Times New Roman" w:eastAsia="Times New Roman" w:hAnsi="Times New Roman" w:cs="Times New Roman"/>
@@ -22176,6 +22542,7 @@
           <w:ilvl w:val="0"/>
           <w:numId w:val="25"/>
         </w:numPr>
+        <w:bidi/>
         <w:spacing w:before="100" w:beforeAutospacing="1" w:after="100" w:afterAutospacing="1" w:line="240" w:lineRule="auto"/>
         <w:rPr>
           <w:rFonts w:ascii="Times New Roman" w:eastAsia="Times New Roman" w:hAnsi="Times New Roman" w:cs="Times New Roman"/>
@@ -22297,6 +22664,7 @@
           <w:ilvl w:val="0"/>
           <w:numId w:val="25"/>
         </w:numPr>
+        <w:bidi/>
         <w:spacing w:before="100" w:beforeAutospacing="1" w:after="100" w:afterAutospacing="1" w:line="240" w:lineRule="auto"/>
         <w:rPr>
           <w:rFonts w:ascii="Times New Roman" w:eastAsia="Times New Roman" w:hAnsi="Times New Roman" w:cs="Times New Roman"/>
@@ -22473,6 +22841,7 @@
     </w:p>
     <w:p>
       <w:pPr>
+        <w:bidi/>
         <w:spacing w:after="0" w:line="240" w:lineRule="auto"/>
         <w:rPr>
           <w:rFonts w:ascii="Times New Roman" w:eastAsia="Times New Roman" w:hAnsi="Times New Roman" w:cs="Times New Roman"/>
@@ -22487,12 +22856,13 @@
           <w:szCs w:val="24"/>
         </w:rPr>
         <w:pict w14:anchorId="4887D00B">
-          <v:rect id="_x0000_i1065" style="width:0;height:1.5pt" o:hralign="center" o:hrstd="t" o:hr="t" fillcolor="#a0a0a0" stroked="f"/>
+          <v:rect id="_x0000_i1042" style="width:0;height:1.5pt" o:hralign="right" o:hrstd="t" o:hr="t" fillcolor="#a0a0a0" stroked="f"/>
         </w:pict>
       </w:r>
     </w:p>
     <w:p>
       <w:pPr>
+        <w:bidi/>
         <w:spacing w:before="100" w:beforeAutospacing="1" w:after="100" w:afterAutospacing="1" w:line="240" w:lineRule="auto"/>
         <w:outlineLvl w:val="2"/>
         <w:rPr>
@@ -22537,6 +22907,7 @@
     </w:p>
     <w:p>
       <w:pPr>
+        <w:bidi/>
         <w:spacing w:before="100" w:beforeAutospacing="1" w:after="100" w:afterAutospacing="1" w:line="240" w:lineRule="auto"/>
         <w:rPr>
           <w:rFonts w:ascii="Times New Roman" w:eastAsia="Times New Roman" w:hAnsi="Times New Roman" w:cs="Times New Roman"/>
@@ -22597,6 +22968,7 @@
           <w:ilvl w:val="0"/>
           <w:numId w:val="26"/>
         </w:numPr>
+        <w:bidi/>
         <w:spacing w:before="100" w:beforeAutospacing="1" w:after="100" w:afterAutospacing="1" w:line="240" w:lineRule="auto"/>
         <w:rPr>
           <w:rFonts w:ascii="Times New Roman" w:eastAsia="Times New Roman" w:hAnsi="Times New Roman" w:cs="Times New Roman"/>
@@ -22834,6 +23206,7 @@
           <w:ilvl w:val="0"/>
           <w:numId w:val="26"/>
         </w:numPr>
+        <w:bidi/>
         <w:spacing w:before="100" w:beforeAutospacing="1" w:after="100" w:afterAutospacing="1" w:line="240" w:lineRule="auto"/>
         <w:rPr>
           <w:rFonts w:ascii="Times New Roman" w:eastAsia="Times New Roman" w:hAnsi="Times New Roman" w:cs="Times New Roman"/>
@@ -23039,6 +23412,7 @@
           <w:ilvl w:val="0"/>
           <w:numId w:val="26"/>
         </w:numPr>
+        <w:bidi/>
         <w:spacing w:before="100" w:beforeAutospacing="1" w:after="100" w:afterAutospacing="1" w:line="240" w:lineRule="auto"/>
         <w:rPr>
           <w:rFonts w:ascii="Times New Roman" w:eastAsia="Times New Roman" w:hAnsi="Times New Roman" w:cs="Times New Roman"/>
@@ -23165,6 +23539,7 @@
           <w:ilvl w:val="0"/>
           <w:numId w:val="26"/>
         </w:numPr>
+        <w:bidi/>
         <w:spacing w:before="100" w:beforeAutospacing="1" w:after="100" w:afterAutospacing="1" w:line="240" w:lineRule="auto"/>
         <w:rPr>
           <w:rFonts w:ascii="Times New Roman" w:eastAsia="Times New Roman" w:hAnsi="Times New Roman" w:cs="Times New Roman"/>
@@ -23296,6 +23671,7 @@
           <w:ilvl w:val="0"/>
           <w:numId w:val="26"/>
         </w:numPr>
+        <w:bidi/>
         <w:spacing w:before="100" w:beforeAutospacing="1" w:after="100" w:afterAutospacing="1" w:line="240" w:lineRule="auto"/>
         <w:rPr>
           <w:rFonts w:ascii="Times New Roman" w:eastAsia="Times New Roman" w:hAnsi="Times New Roman" w:cs="Times New Roman"/>
@@ -23487,6 +23863,7 @@
           <w:ilvl w:val="0"/>
           <w:numId w:val="26"/>
         </w:numPr>
+        <w:bidi/>
         <w:spacing w:before="100" w:beforeAutospacing="1" w:after="100" w:afterAutospacing="1" w:line="240" w:lineRule="auto"/>
         <w:rPr>
           <w:rFonts w:ascii="Times New Roman" w:eastAsia="Times New Roman" w:hAnsi="Times New Roman" w:cs="Times New Roman"/>
@@ -23705,6 +24082,7 @@
           <w:ilvl w:val="0"/>
           <w:numId w:val="26"/>
         </w:numPr>
+        <w:bidi/>
         <w:spacing w:before="100" w:beforeAutospacing="1" w:after="100" w:afterAutospacing="1" w:line="240" w:lineRule="auto"/>
         <w:rPr>
           <w:rFonts w:ascii="Times New Roman" w:eastAsia="Times New Roman" w:hAnsi="Times New Roman" w:cs="Times New Roman"/>
@@ -23896,6 +24274,7 @@
           <w:ilvl w:val="0"/>
           <w:numId w:val="26"/>
         </w:numPr>
+        <w:bidi/>
         <w:spacing w:before="100" w:beforeAutospacing="1" w:after="100" w:afterAutospacing="1" w:line="240" w:lineRule="auto"/>
         <w:rPr>
           <w:rFonts w:ascii="Times New Roman" w:eastAsia="Times New Roman" w:hAnsi="Times New Roman" w:cs="Times New Roman"/>
@@ -24040,6 +24419,7 @@
           <w:ilvl w:val="0"/>
           <w:numId w:val="26"/>
         </w:numPr>
+        <w:bidi/>
         <w:spacing w:before="100" w:beforeAutospacing="1" w:after="100" w:afterAutospacing="1" w:line="240" w:lineRule="auto"/>
         <w:rPr>
           <w:rFonts w:ascii="Times New Roman" w:eastAsia="Times New Roman" w:hAnsi="Times New Roman" w:cs="Times New Roman"/>
@@ -24166,6 +24546,7 @@
           <w:ilvl w:val="0"/>
           <w:numId w:val="26"/>
         </w:numPr>
+        <w:bidi/>
         <w:spacing w:before="100" w:beforeAutospacing="1" w:after="100" w:afterAutospacing="1" w:line="240" w:lineRule="auto"/>
         <w:rPr>
           <w:rFonts w:ascii="Times New Roman" w:eastAsia="Times New Roman" w:hAnsi="Times New Roman" w:cs="Times New Roman"/>
@@ -24339,6 +24720,7 @@
     </w:p>
     <w:p>
       <w:pPr>
+        <w:bidi/>
         <w:spacing w:after="0" w:line="240" w:lineRule="auto"/>
         <w:rPr>
           <w:rFonts w:ascii="Times New Roman" w:eastAsia="Times New Roman" w:hAnsi="Times New Roman" w:cs="Times New Roman"/>
@@ -24353,12 +24735,13 @@
           <w:szCs w:val="24"/>
         </w:rPr>
         <w:pict w14:anchorId="1D451070">
-          <v:rect id="_x0000_i1066" style="width:0;height:1.5pt" o:hralign="center" o:hrstd="t" o:hr="t" fillcolor="#a0a0a0" stroked="f"/>
+          <v:rect id="_x0000_i1043" style="width:0;height:1.5pt" o:hralign="right" o:hrstd="t" o:hr="t" fillcolor="#a0a0a0" stroked="f"/>
         </w:pict>
       </w:r>
     </w:p>
     <w:p>
       <w:pPr>
+        <w:bidi/>
         <w:spacing w:before="100" w:beforeAutospacing="1" w:after="100" w:afterAutospacing="1" w:line="240" w:lineRule="auto"/>
         <w:outlineLvl w:val="2"/>
         <w:rPr>
@@ -24398,6 +24781,7 @@
           <w:ilvl w:val="0"/>
           <w:numId w:val="27"/>
         </w:numPr>
+        <w:bidi/>
         <w:spacing w:before="100" w:beforeAutospacing="1" w:after="100" w:afterAutospacing="1" w:line="240" w:lineRule="auto"/>
         <w:rPr>
           <w:rFonts w:ascii="Times New Roman" w:eastAsia="Times New Roman" w:hAnsi="Times New Roman" w:cs="Times New Roman"/>
@@ -24510,6 +24894,7 @@
           <w:ilvl w:val="0"/>
           <w:numId w:val="27"/>
         </w:numPr>
+        <w:bidi/>
         <w:spacing w:before="100" w:beforeAutospacing="1" w:after="100" w:afterAutospacing="1" w:line="240" w:lineRule="auto"/>
         <w:rPr>
           <w:rFonts w:ascii="Times New Roman" w:eastAsia="Times New Roman" w:hAnsi="Times New Roman" w:cs="Times New Roman"/>
@@ -24622,6 +25007,7 @@
           <w:ilvl w:val="0"/>
           <w:numId w:val="27"/>
         </w:numPr>
+        <w:bidi/>
         <w:spacing w:before="100" w:beforeAutospacing="1" w:after="100" w:afterAutospacing="1" w:line="240" w:lineRule="auto"/>
         <w:rPr>
           <w:rFonts w:ascii="Times New Roman" w:eastAsia="Times New Roman" w:hAnsi="Times New Roman" w:cs="Times New Roman"/>
@@ -24744,6 +25130,7 @@
     </w:p>
     <w:p>
       <w:pPr>
+        <w:bidi/>
         <w:spacing w:after="0" w:line="240" w:lineRule="auto"/>
         <w:rPr>
           <w:rFonts w:ascii="Times New Roman" w:eastAsia="Times New Roman" w:hAnsi="Times New Roman" w:cs="Times New Roman"/>
@@ -24758,12 +25145,13 @@
           <w:szCs w:val="24"/>
         </w:rPr>
         <w:pict w14:anchorId="7D945560">
-          <v:rect id="_x0000_i1067" style="width:0;height:1.5pt" o:hralign="center" o:hrstd="t" o:hr="t" fillcolor="#a0a0a0" stroked="f"/>
+          <v:rect id="_x0000_i1044" style="width:0;height:1.5pt" o:hralign="right" o:hrstd="t" o:hr="t" fillcolor="#a0a0a0" stroked="f"/>
         </w:pict>
       </w:r>
     </w:p>
     <w:p>
       <w:pPr>
+        <w:bidi/>
         <w:spacing w:before="100" w:beforeAutospacing="1" w:after="100" w:afterAutospacing="1" w:line="240" w:lineRule="auto"/>
         <w:outlineLvl w:val="2"/>
         <w:rPr>
@@ -24802,6 +25190,7 @@
           <w:ilvl w:val="0"/>
           <w:numId w:val="28"/>
         </w:numPr>
+        <w:bidi/>
         <w:spacing w:before="100" w:beforeAutospacing="1" w:after="100" w:afterAutospacing="1" w:line="240" w:lineRule="auto"/>
         <w:rPr>
           <w:rFonts w:ascii="Times New Roman" w:eastAsia="Times New Roman" w:hAnsi="Times New Roman" w:cs="Times New Roman"/>
@@ -24931,6 +25320,7 @@
           <w:ilvl w:val="0"/>
           <w:numId w:val="28"/>
         </w:numPr>
+        <w:bidi/>
         <w:spacing w:before="100" w:beforeAutospacing="1" w:after="100" w:afterAutospacing="1" w:line="240" w:lineRule="auto"/>
         <w:rPr>
           <w:rFonts w:ascii="Times New Roman" w:eastAsia="Times New Roman" w:hAnsi="Times New Roman" w:cs="Times New Roman"/>
@@ -25146,6 +25536,7 @@
           <w:ilvl w:val="0"/>
           <w:numId w:val="28"/>
         </w:numPr>
+        <w:bidi/>
         <w:spacing w:before="100" w:beforeAutospacing="1" w:after="100" w:afterAutospacing="1" w:line="240" w:lineRule="auto"/>
         <w:rPr>
           <w:rFonts w:ascii="Times New Roman" w:eastAsia="Times New Roman" w:hAnsi="Times New Roman" w:cs="Times New Roman"/>
@@ -25430,6 +25821,7 @@
           <w:ilvl w:val="0"/>
           <w:numId w:val="28"/>
         </w:numPr>
+        <w:bidi/>
         <w:spacing w:before="100" w:beforeAutospacing="1" w:after="100" w:afterAutospacing="1" w:line="240" w:lineRule="auto"/>
         <w:rPr>
           <w:rFonts w:ascii="Times New Roman" w:eastAsia="Times New Roman" w:hAnsi="Times New Roman" w:cs="Times New Roman"/>
@@ -25633,6 +26025,7 @@
           <w:ilvl w:val="0"/>
           <w:numId w:val="28"/>
         </w:numPr>
+        <w:bidi/>
         <w:spacing w:before="100" w:beforeAutospacing="1" w:after="100" w:afterAutospacing="1" w:line="240" w:lineRule="auto"/>
         <w:rPr>
           <w:rFonts w:ascii="Times New Roman" w:eastAsia="Times New Roman" w:hAnsi="Times New Roman" w:cs="Times New Roman"/>
@@ -25773,6 +26166,7 @@
     </w:p>
     <w:p>
       <w:pPr>
+        <w:bidi/>
         <w:rPr>
           <w:rFonts w:ascii="Times New Roman" w:eastAsia="Times New Roman" w:hAnsi="Times New Roman" w:cs="Times New Roman"/>
           <w:sz w:val="24"/>
@@ -25791,6 +26185,7 @@
     <w:p>
       <w:pPr>
         <w:pStyle w:val="Heading2"/>
+        <w:bidi/>
       </w:pPr>
       <w:r>
         <w:lastRenderedPageBreak/>
@@ -25815,6 +26210,7 @@
     <w:p>
       <w:pPr>
         <w:pStyle w:val="NormalWeb"/>
+        <w:bidi/>
       </w:pPr>
       <w:r>
         <w:rPr>
@@ -25829,6 +26225,7 @@
     <w:p>
       <w:pPr>
         <w:pStyle w:val="Heading3"/>
+        <w:bidi/>
       </w:pPr>
       <w:r>
         <w:t xml:space="preserve">### 1. </w:t>
@@ -25850,6 +26247,7 @@
           <w:ilvl w:val="0"/>
           <w:numId w:val="30"/>
         </w:numPr>
+        <w:bidi/>
       </w:pPr>
       <w:r>
         <w:rPr>
@@ -25866,6 +26264,7 @@
           <w:ilvl w:val="1"/>
           <w:numId w:val="30"/>
         </w:numPr>
+        <w:bidi/>
       </w:pPr>
       <w:r>
         <w:rPr>
@@ -25885,7 +26284,7 @@
       <w:r>
         <w:t xml:space="preserve"> </w:t>
       </w:r>
-      <w:hyperlink r:id="rId5" w:tgtFrame="_blank" w:history="1">
+      <w:hyperlink r:id="rId6" w:tgtFrame="_blank" w:history="1">
         <w:r>
           <w:rPr>
             <w:rStyle w:val="Hyperlink"/>
@@ -25901,6 +26300,7 @@
           <w:ilvl w:val="1"/>
           <w:numId w:val="30"/>
         </w:numPr>
+        <w:bidi/>
       </w:pPr>
       <w:r>
         <w:rPr>
@@ -25937,6 +26337,7 @@
           <w:ilvl w:val="0"/>
           <w:numId w:val="30"/>
         </w:numPr>
+        <w:bidi/>
       </w:pPr>
       <w:r>
         <w:rPr>
@@ -25969,6 +26370,7 @@
           <w:ilvl w:val="1"/>
           <w:numId w:val="30"/>
         </w:numPr>
+        <w:bidi/>
       </w:pPr>
       <w:r>
         <w:rPr>
@@ -25988,7 +26390,7 @@
       <w:r>
         <w:t xml:space="preserve"> </w:t>
       </w:r>
-      <w:hyperlink r:id="rId6" w:tgtFrame="_blank" w:history="1">
+      <w:hyperlink r:id="rId7" w:tgtFrame="_blank" w:history="1">
         <w:proofErr w:type="spellStart"/>
         <w:r>
           <w:rPr>
@@ -26012,6 +26414,7 @@
           <w:ilvl w:val="1"/>
           <w:numId w:val="30"/>
         </w:numPr>
+        <w:bidi/>
       </w:pPr>
       <w:r>
         <w:rPr>
@@ -26048,6 +26451,7 @@
           <w:ilvl w:val="0"/>
           <w:numId w:val="30"/>
         </w:numPr>
+        <w:bidi/>
       </w:pPr>
       <w:r>
         <w:rPr>
@@ -26080,6 +26484,7 @@
           <w:ilvl w:val="1"/>
           <w:numId w:val="30"/>
         </w:numPr>
+        <w:bidi/>
       </w:pPr>
       <w:r>
         <w:rPr>
@@ -26099,7 +26504,7 @@
       <w:r>
         <w:t xml:space="preserve"> </w:t>
       </w:r>
-      <w:hyperlink r:id="rId7" w:tgtFrame="_blank" w:history="1">
+      <w:hyperlink r:id="rId8" w:tgtFrame="_blank" w:history="1">
         <w:r>
           <w:rPr>
             <w:rStyle w:val="Hyperlink"/>
@@ -26115,6 +26520,7 @@
           <w:ilvl w:val="1"/>
           <w:numId w:val="30"/>
         </w:numPr>
+        <w:bidi/>
       </w:pPr>
       <w:r>
         <w:rPr>
@@ -26147,6 +26553,7 @@
     <w:p>
       <w:pPr>
         <w:pStyle w:val="NormalWeb"/>
+        <w:bidi/>
         <w:rPr>
           <w:rtl/>
         </w:rPr>
@@ -26155,6 +26562,7 @@
     <w:p>
       <w:pPr>
         <w:pStyle w:val="NormalWeb"/>
+        <w:bidi/>
         <w:rPr>
           <w:rtl/>
         </w:rPr>
@@ -26163,19 +26571,25 @@
     <w:p>
       <w:pPr>
         <w:pStyle w:val="NormalWeb"/>
-        <w:rPr>
-          <w:rtl/>
-        </w:rPr>
-      </w:pPr>
+        <w:bidi/>
+        <w:rPr>
+          <w:rtl/>
+        </w:rPr>
+      </w:pPr>
+      <w:r>
+        <w:br/>
+      </w:r>
     </w:p>
     <w:p>
       <w:pPr>
         <w:pStyle w:val="NormalWeb"/>
+        <w:bidi/>
       </w:pPr>
     </w:p>
     <w:p>
       <w:pPr>
         <w:pStyle w:val="Heading3"/>
+        <w:bidi/>
       </w:pPr>
       <w:r>
         <w:t xml:space="preserve">### 2. </w:t>
@@ -26193,6 +26607,7 @@
     <w:p>
       <w:pPr>
         <w:pStyle w:val="NormalWeb"/>
+        <w:bidi/>
       </w:pPr>
       <w:r>
         <w:rPr>
@@ -26211,6 +26626,7 @@
           <w:ilvl w:val="0"/>
           <w:numId w:val="31"/>
         </w:numPr>
+        <w:bidi/>
       </w:pPr>
       <w:r>
         <w:rPr>
@@ -26227,6 +26643,7 @@
           <w:ilvl w:val="1"/>
           <w:numId w:val="31"/>
         </w:numPr>
+        <w:bidi/>
       </w:pPr>
       <w:r>
         <w:rPr>
@@ -26246,7 +26663,7 @@
       <w:r>
         <w:t xml:space="preserve"> </w:t>
       </w:r>
-      <w:hyperlink r:id="rId8" w:tgtFrame="_blank" w:history="1">
+      <w:hyperlink r:id="rId9" w:tgtFrame="_blank" w:history="1">
         <w:r>
           <w:rPr>
             <w:rStyle w:val="Hyperlink"/>
@@ -26262,6 +26679,7 @@
           <w:ilvl w:val="1"/>
           <w:numId w:val="31"/>
         </w:numPr>
+        <w:bidi/>
       </w:pPr>
       <w:r>
         <w:rPr>
@@ -26298,6 +26716,7 @@
           <w:ilvl w:val="0"/>
           <w:numId w:val="31"/>
         </w:numPr>
+        <w:bidi/>
       </w:pPr>
       <w:r>
         <w:rPr>
@@ -26314,6 +26733,7 @@
           <w:ilvl w:val="1"/>
           <w:numId w:val="31"/>
         </w:numPr>
+        <w:bidi/>
       </w:pPr>
       <w:r>
         <w:rPr>
@@ -26333,7 +26753,7 @@
       <w:r>
         <w:t xml:space="preserve"> </w:t>
       </w:r>
-      <w:hyperlink r:id="rId9" w:tgtFrame="_blank" w:history="1">
+      <w:hyperlink r:id="rId10" w:tgtFrame="_blank" w:history="1">
         <w:r>
           <w:rPr>
             <w:rStyle w:val="Hyperlink"/>
@@ -26349,6 +26769,7 @@
           <w:ilvl w:val="1"/>
           <w:numId w:val="31"/>
         </w:numPr>
+        <w:bidi/>
       </w:pPr>
       <w:r>
         <w:rPr>
@@ -26465,6 +26886,7 @@
     <w:p>
       <w:pPr>
         <w:pStyle w:val="NormalWeb"/>
+        <w:bidi/>
         <w:rPr>
           <w:rtl/>
         </w:rPr>
@@ -26473,6 +26895,7 @@
     <w:p>
       <w:pPr>
         <w:pStyle w:val="NormalWeb"/>
+        <w:bidi/>
         <w:rPr>
           <w:rtl/>
         </w:rPr>
@@ -26481,6 +26904,7 @@
     <w:p>
       <w:pPr>
         <w:pStyle w:val="NormalWeb"/>
+        <w:bidi/>
         <w:rPr>
           <w:rtl/>
         </w:rPr>
@@ -26489,11 +26913,13 @@
     <w:p>
       <w:pPr>
         <w:pStyle w:val="NormalWeb"/>
+        <w:bidi/>
       </w:pPr>
     </w:p>
     <w:p>
       <w:pPr>
         <w:pStyle w:val="Heading3"/>
+        <w:bidi/>
       </w:pPr>
       <w:r>
         <w:t xml:space="preserve">### 3. </w:t>
@@ -26511,6 +26937,7 @@
     <w:p>
       <w:pPr>
         <w:pStyle w:val="NormalWeb"/>
+        <w:bidi/>
       </w:pPr>
       <w:r>
         <w:rPr>
@@ -26529,6 +26956,7 @@
           <w:ilvl w:val="0"/>
           <w:numId w:val="32"/>
         </w:numPr>
+        <w:bidi/>
       </w:pPr>
       <w:r>
         <w:rPr>
@@ -26545,6 +26973,7 @@
           <w:ilvl w:val="1"/>
           <w:numId w:val="32"/>
         </w:numPr>
+        <w:bidi/>
       </w:pPr>
       <w:r>
         <w:rPr>
@@ -26615,6 +27044,7 @@
           <w:ilvl w:val="0"/>
           <w:numId w:val="32"/>
         </w:numPr>
+        <w:bidi/>
       </w:pPr>
       <w:r>
         <w:rPr>
@@ -26647,6 +27077,7 @@
           <w:ilvl w:val="1"/>
           <w:numId w:val="32"/>
         </w:numPr>
+        <w:bidi/>
       </w:pPr>
       <w:r>
         <w:rPr>
@@ -26692,6 +27123,7 @@
           <w:ilvl w:val="0"/>
           <w:numId w:val="32"/>
         </w:numPr>
+        <w:bidi/>
       </w:pPr>
       <w:r>
         <w:rPr>
@@ -26724,6 +27156,7 @@
           <w:ilvl w:val="1"/>
           <w:numId w:val="32"/>
         </w:numPr>
+        <w:bidi/>
       </w:pPr>
       <w:r>
         <w:rPr>
@@ -26756,6 +27189,7 @@
     <w:p>
       <w:pPr>
         <w:pStyle w:val="NormalWeb"/>
+        <w:bidi/>
         <w:rPr>
           <w:rtl/>
         </w:rPr>
@@ -26764,6 +27198,7 @@
     <w:p>
       <w:pPr>
         <w:pStyle w:val="NormalWeb"/>
+        <w:bidi/>
         <w:rPr>
           <w:rtl/>
         </w:rPr>
@@ -26772,6 +27207,7 @@
     <w:p>
       <w:pPr>
         <w:pStyle w:val="NormalWeb"/>
+        <w:bidi/>
         <w:rPr>
           <w:rtl/>
         </w:rPr>
@@ -26780,6 +27216,7 @@
     <w:p>
       <w:pPr>
         <w:pStyle w:val="NormalWeb"/>
+        <w:bidi/>
         <w:jc w:val="center"/>
         <w:rPr>
           <w:b/>
@@ -26828,6 +27265,7 @@
     </w:p>
     <w:p>
       <w:pPr>
+        <w:bidi/>
         <w:spacing w:before="100" w:beforeAutospacing="1" w:after="100" w:afterAutospacing="1" w:line="240" w:lineRule="auto"/>
         <w:rPr>
           <w:rFonts w:ascii="Times New Roman" w:eastAsia="Times New Roman" w:hAnsi="Times New Roman" w:cs="Times New Roman"/>
@@ -32465,4 +32903,16 @@
     </a:ext>
   </a:extLst>
 </a:theme>
+</file>
+
+<file path=customXml/item1.xml><?xml version="1.0" encoding="utf-8"?>
+<b:Sources xmlns:b="http://schemas.openxmlformats.org/officeDocument/2006/bibliography" xmlns="http://schemas.openxmlformats.org/officeDocument/2006/bibliography" SelectedStyle="\APASixthEditionOfficeOnline.xsl" StyleName="APA" Version="6"/>
+</file>
+
+<file path=customXml/itemProps1.xml><?xml version="1.0" encoding="utf-8"?>
+<ds:datastoreItem xmlns:ds="http://schemas.openxmlformats.org/officeDocument/2006/customXml" ds:itemID="{9988F225-FADF-4721-ACAC-1D354F34F2BC}">
+  <ds:schemaRefs>
+    <ds:schemaRef ds:uri="http://schemas.openxmlformats.org/officeDocument/2006/bibliography"/>
+  </ds:schemaRefs>
+</ds:datastoreItem>
 </file>
</xml_diff>